<commit_message>
Add sensor integrations for methane pressure humidity
</commit_message>
<xml_diff>
--- a/docs/firmware-overview.docx
+++ b/docs/firmware-overview.docx
@@ -241,12 +241,7 @@
         <w:spacing w:after="120"/>
       </w:pPr>
       <w:r>
-        <w:rPr>
-          <w:rFonts w:ascii="Calibri" w:hAnsi="Calibri"/>
-          <w:color w:val="1A1F26"/>
-          <w:sz w:val="21"/>
-        </w:rPr>
-        <w:t>The firmware reads methane gas and pressure sensors, publishes measurements over</w:t>
+        <w:t>The firmware reads methane gas from a Dynament Platinum Hydrocarbon infrared sensor,</w:t>
       </w:r>
     </w:p>
     <w:p>
@@ -254,12 +249,7 @@
         <w:spacing w:after="120"/>
       </w:pPr>
       <w:r>
-        <w:rPr>
-          <w:rFonts w:ascii="Calibri" w:hAnsi="Calibri"/>
-          <w:color w:val="1A1F26"/>
-          <w:sz w:val="21"/>
-        </w:rPr>
-        <w:t>RS485, and drives two 4-20 mA analog outputs through two GP8302 current DAC</w:t>
+        <w:t>pressure from an MS580305BA01-00 sensor, and humidity/ambient temperature from an HTU21D sensor.</w:t>
       </w:r>
     </w:p>
     <w:p>
@@ -267,12 +257,7 @@
         <w:spacing w:after="120"/>
       </w:pPr>
       <w:r>
-        <w:rPr>
-          <w:rFonts w:ascii="Calibri" w:hAnsi="Calibri"/>
-          <w:color w:val="1A1F26"/>
-          <w:sz w:val="21"/>
-        </w:rPr>
-        <w:t>devices. The design is power-first: external sensor and analog rails are off by default and are enabled only during measurement or output update windows.</w:t>
+        <w:t>It publishes measurements over RS485 and drives two 4-20 mA analog outputs through two GP8302 current DAC devices. The design is power-first, while keeping the Dynament methane sensor powered continuously by default.</w:t>
       </w:r>
     </w:p>
     <w:p>
@@ -1062,128 +1047,8 @@
             <w:vAlign w:val="center"/>
           </w:tcPr>
           <w:p>
-            <w:pPr>
-              <w:spacing w:after="0"/>
-            </w:pPr>
-            <w:r/>
             <w:r>
-              <w:rPr>
-                <w:rFonts w:ascii="Calibri" w:hAnsi="Calibri"/>
-                <w:b w:val="0"/>
-                <w:color w:val="1A1F26"/>
-                <w:sz w:val="17"/>
-              </w:rPr>
-              <w:t>Methane sensor UART</w:t>
-            </w:r>
-          </w:p>
-        </w:tc>
-      </w:tr>
-      <w:tr>
-        <w:tc>
-          <w:tcPr>
-            <w:tcW w:type="dxa" w:w="1300"/>
-            <w:tcMar>
-              <w:top w:w="80" w:type="dxa"/>
-              <w:start w:w="120" w:type="dxa"/>
-              <w:bottom w:w="80" w:type="dxa"/>
-              <w:end w:w="120" w:type="dxa"/>
-            </w:tcMar>
-            <w:vAlign w:val="center"/>
-          </w:tcPr>
-          <w:p>
-            <w:pPr>
-              <w:spacing w:after="0"/>
-            </w:pPr>
-            <w:r/>
-            <w:r>
-              <w:rPr>
-                <w:rFonts w:ascii="Calibri" w:hAnsi="Calibri"/>
-                <w:b w:val="0"/>
-                <w:color w:val="1A1F26"/>
-                <w:sz w:val="17"/>
-              </w:rPr>
-              <w:t>DAC0 and EEPROM bus</w:t>
-            </w:r>
-          </w:p>
-        </w:tc>
-        <w:tc>
-          <w:tcPr>
-            <w:tcW w:type="dxa" w:w="2100"/>
-            <w:tcMar>
-              <w:top w:w="80" w:type="dxa"/>
-              <w:start w:w="120" w:type="dxa"/>
-              <w:bottom w:w="80" w:type="dxa"/>
-              <w:end w:w="120" w:type="dxa"/>
-            </w:tcMar>
-            <w:vAlign w:val="center"/>
-          </w:tcPr>
-          <w:p>
-            <w:pPr>
-              <w:spacing w:after="0"/>
-            </w:pPr>
-            <w:r/>
-            <w:r>
-              <w:rPr>
-                <w:rFonts w:ascii="Calibri" w:hAnsi="Calibri"/>
-                <w:b w:val="0"/>
-                <w:color w:val="1A1F26"/>
-                <w:sz w:val="17"/>
-              </w:rPr>
-              <w:t>i2c1</w:t>
-            </w:r>
-          </w:p>
-        </w:tc>
-        <w:tc>
-          <w:tcPr>
-            <w:tcW w:type="dxa" w:w="2200"/>
-            <w:tcMar>
-              <w:top w:w="80" w:type="dxa"/>
-              <w:start w:w="120" w:type="dxa"/>
-              <w:bottom w:w="80" w:type="dxa"/>
-              <w:end w:w="120" w:type="dxa"/>
-            </w:tcMar>
-            <w:vAlign w:val="center"/>
-          </w:tcPr>
-          <w:p>
-            <w:pPr>
-              <w:spacing w:after="0"/>
-            </w:pPr>
-            <w:r/>
-            <w:r>
-              <w:rPr>
-                <w:rFonts w:ascii="Calibri" w:hAnsi="Calibri"/>
-                <w:b w:val="0"/>
-                <w:color w:val="1A1F26"/>
-                <w:sz w:val="17"/>
-              </w:rPr>
-              <w:t>PB8, PB9</w:t>
-            </w:r>
-          </w:p>
-        </w:tc>
-        <w:tc>
-          <w:tcPr>
-            <w:tcW w:type="dxa" w:w="3760"/>
-            <w:tcMar>
-              <w:top w:w="80" w:type="dxa"/>
-              <w:start w:w="120" w:type="dxa"/>
-              <w:bottom w:w="80" w:type="dxa"/>
-              <w:end w:w="120" w:type="dxa"/>
-            </w:tcMar>
-            <w:vAlign w:val="center"/>
-          </w:tcPr>
-          <w:p>
-            <w:pPr>
-              <w:spacing w:after="0"/>
-            </w:pPr>
-            <w:r/>
-            <w:r>
-              <w:rPr>
-                <w:rFonts w:ascii="Calibri" w:hAnsi="Calibri"/>
-                <w:b w:val="0"/>
-                <w:color w:val="1A1F26"/>
-                <w:sz w:val="17"/>
-              </w:rPr>
-              <w:t>Methane GP8302 at 0x58 and EEPROM</w:t>
+              <w:t>Dynament Platinum methane UART, 38400 baud</w:t>
             </w:r>
           </w:p>
         </w:tc>
@@ -1322,6 +1187,186 @@
                 <w:color w:val="1A1F26"/>
                 <w:sz w:val="17"/>
               </w:rPr>
+              <w:t>DAC0 and EEPROM bus</w:t>
+            </w:r>
+          </w:p>
+        </w:tc>
+        <w:tc>
+          <w:tcPr>
+            <w:tcW w:type="dxa" w:w="2100"/>
+            <w:tcMar>
+              <w:top w:w="80" w:type="dxa"/>
+              <w:start w:w="120" w:type="dxa"/>
+              <w:bottom w:w="80" w:type="dxa"/>
+              <w:end w:w="120" w:type="dxa"/>
+            </w:tcMar>
+            <w:vAlign w:val="center"/>
+          </w:tcPr>
+          <w:p>
+            <w:pPr>
+              <w:spacing w:after="0"/>
+            </w:pPr>
+            <w:r/>
+            <w:r>
+              <w:rPr>
+                <w:rFonts w:ascii="Calibri" w:hAnsi="Calibri"/>
+                <w:b w:val="0"/>
+                <w:color w:val="1A1F26"/>
+                <w:sz w:val="17"/>
+              </w:rPr>
+              <w:t>i2c1</w:t>
+            </w:r>
+          </w:p>
+        </w:tc>
+        <w:tc>
+          <w:tcPr>
+            <w:tcW w:type="dxa" w:w="2200"/>
+            <w:tcMar>
+              <w:top w:w="80" w:type="dxa"/>
+              <w:start w:w="120" w:type="dxa"/>
+              <w:bottom w:w="80" w:type="dxa"/>
+              <w:end w:w="120" w:type="dxa"/>
+            </w:tcMar>
+            <w:vAlign w:val="center"/>
+          </w:tcPr>
+          <w:p>
+            <w:pPr>
+              <w:spacing w:after="0"/>
+            </w:pPr>
+            <w:r/>
+            <w:r>
+              <w:rPr>
+                <w:rFonts w:ascii="Calibri" w:hAnsi="Calibri"/>
+                <w:b w:val="0"/>
+                <w:color w:val="1A1F26"/>
+                <w:sz w:val="17"/>
+              </w:rPr>
+              <w:t>PB8, PB9</w:t>
+            </w:r>
+          </w:p>
+        </w:tc>
+        <w:tc>
+          <w:tcPr>
+            <w:tcW w:type="dxa" w:w="3760"/>
+            <w:tcMar>
+              <w:top w:w="80" w:type="dxa"/>
+              <w:start w:w="120" w:type="dxa"/>
+              <w:bottom w:w="80" w:type="dxa"/>
+              <w:end w:w="120" w:type="dxa"/>
+            </w:tcMar>
+            <w:vAlign w:val="center"/>
+          </w:tcPr>
+          <w:p>
+            <w:pPr>
+              <w:spacing w:after="0"/>
+            </w:pPr>
+            <w:r/>
+            <w:r>
+              <w:rPr>
+                <w:rFonts w:ascii="Calibri" w:hAnsi="Calibri"/>
+                <w:b w:val="0"/>
+                <w:color w:val="1A1F26"/>
+                <w:sz w:val="17"/>
+              </w:rPr>
+              <w:t>Methane GP8302 at 0x58 and EEPROM</w:t>
+            </w:r>
+          </w:p>
+        </w:tc>
+      </w:tr>
+      <w:tr>
+        <w:tc>
+          <w:tcPr>
+            <w:tcW w:type="dxa" w:w="1300"/>
+            <w:tcMar>
+              <w:top w:w="80" w:type="dxa"/>
+              <w:start w:w="120" w:type="dxa"/>
+              <w:bottom w:w="80" w:type="dxa"/>
+              <w:end w:w="120" w:type="dxa"/>
+            </w:tcMar>
+            <w:vAlign w:val="center"/>
+          </w:tcPr>
+          <w:p>
+            <w:r>
+              <w:t>Humidity sensor</w:t>
+            </w:r>
+          </w:p>
+        </w:tc>
+        <w:tc>
+          <w:tcPr>
+            <w:tcW w:type="dxa" w:w="2100"/>
+            <w:tcMar>
+              <w:top w:w="80" w:type="dxa"/>
+              <w:start w:w="120" w:type="dxa"/>
+              <w:bottom w:w="80" w:type="dxa"/>
+              <w:end w:w="120" w:type="dxa"/>
+            </w:tcMar>
+            <w:vAlign w:val="center"/>
+          </w:tcPr>
+          <w:p>
+            <w:r>
+              <w:t>i2c2</w:t>
+            </w:r>
+          </w:p>
+        </w:tc>
+        <w:tc>
+          <w:tcPr>
+            <w:tcW w:type="dxa" w:w="2200"/>
+            <w:tcMar>
+              <w:top w:w="80" w:type="dxa"/>
+              <w:start w:w="120" w:type="dxa"/>
+              <w:bottom w:w="80" w:type="dxa"/>
+              <w:end w:w="120" w:type="dxa"/>
+            </w:tcMar>
+            <w:vAlign w:val="center"/>
+          </w:tcPr>
+          <w:p>
+            <w:r>
+              <w:t>PB10, PB14</w:t>
+            </w:r>
+          </w:p>
+        </w:tc>
+        <w:tc>
+          <w:tcPr>
+            <w:tcW w:type="dxa" w:w="3760"/>
+            <w:tcMar>
+              <w:top w:w="80" w:type="dxa"/>
+              <w:start w:w="120" w:type="dxa"/>
+              <w:bottom w:w="80" w:type="dxa"/>
+              <w:end w:w="120" w:type="dxa"/>
+            </w:tcMar>
+            <w:vAlign w:val="center"/>
+          </w:tcPr>
+          <w:p>
+            <w:r>
+              <w:t>HTU21D at 0x40, Zephyr sensirion,sht21 compatible</w:t>
+            </w:r>
+          </w:p>
+        </w:tc>
+      </w:tr>
+      <w:tr>
+        <w:tc>
+          <w:tcPr>
+            <w:tcW w:type="dxa" w:w="1300"/>
+            <w:tcMar>
+              <w:top w:w="80" w:type="dxa"/>
+              <w:start w:w="120" w:type="dxa"/>
+              <w:bottom w:w="80" w:type="dxa"/>
+              <w:end w:w="120" w:type="dxa"/>
+            </w:tcMar>
+            <w:vAlign w:val="center"/>
+          </w:tcPr>
+          <w:p>
+            <w:pPr>
+              <w:spacing w:after="0"/>
+            </w:pPr>
+            <w:r/>
+            <w:r>
+              <w:rPr>
+                <w:rFonts w:ascii="Calibri" w:hAnsi="Calibri"/>
+                <w:b w:val="0"/>
+                <w:color w:val="1A1F26"/>
+                <w:sz w:val="17"/>
+              </w:rPr>
               <w:t>Pressure sensor</w:t>
             </w:r>
           </w:p>
@@ -1392,18 +1437,8 @@
             <w:vAlign w:val="center"/>
           </w:tcPr>
           <w:p>
-            <w:pPr>
-              <w:spacing w:after="0"/>
-            </w:pPr>
-            <w:r/>
             <w:r>
-              <w:rPr>
-                <w:rFonts w:ascii="Calibri" w:hAnsi="Calibri"/>
-                <w:b w:val="0"/>
-                <w:color w:val="1A1F26"/>
-                <w:sz w:val="17"/>
-              </w:rPr>
-              <w:t>Pressure sensor SPI</w:t>
+              <w:t>MS580305BA01-00 / MS5803-05BA pressure sensor SPI</w:t>
             </w:r>
           </w:p>
         </w:tc>
@@ -1740,6 +1775,89 @@
                 <w:color w:val="1A1F26"/>
                 <w:sz w:val="18"/>
               </w:rPr>
+              <w:t>dac1-output-source</w:t>
+            </w:r>
+          </w:p>
+        </w:tc>
+        <w:tc>
+          <w:tcPr>
+            <w:tcW w:type="dxa" w:w="3860"/>
+            <w:tcMar>
+              <w:top w:w="80" w:type="dxa"/>
+              <w:start w:w="120" w:type="dxa"/>
+              <w:bottom w:w="80" w:type="dxa"/>
+              <w:end w:w="120" w:type="dxa"/>
+            </w:tcMar>
+            <w:vAlign w:val="center"/>
+          </w:tcPr>
+          <w:p>
+            <w:pPr>
+              <w:spacing w:after="0"/>
+            </w:pPr>
+            <w:r/>
+            <w:r>
+              <w:rPr>
+                <w:rFonts w:ascii="Calibri" w:hAnsi="Calibri"/>
+                <w:b w:val="0"/>
+                <w:color w:val="1A1F26"/>
+                <w:sz w:val="18"/>
+              </w:rPr>
+              <w:t>Documents GP8302 DAC1 source on i2c2</w:t>
+            </w:r>
+          </w:p>
+        </w:tc>
+        <w:tc>
+          <w:tcPr>
+            <w:tcW w:type="dxa" w:w="2900"/>
+            <w:tcMar>
+              <w:top w:w="80" w:type="dxa"/>
+              <w:start w:w="120" w:type="dxa"/>
+              <w:bottom w:w="80" w:type="dxa"/>
+              <w:end w:w="120" w:type="dxa"/>
+            </w:tcMar>
+            <w:vAlign w:val="center"/>
+          </w:tcPr>
+          <w:p>
+            <w:pPr>
+              <w:spacing w:after="0"/>
+            </w:pPr>
+            <w:r/>
+            <w:r>
+              <w:rPr>
+                <w:rFonts w:ascii="Calibri" w:hAnsi="Calibri"/>
+                <w:b w:val="0"/>
+                <w:color w:val="1A1F26"/>
+                <w:sz w:val="18"/>
+              </w:rPr>
+              <w:t>pressure</w:t>
+            </w:r>
+          </w:p>
+        </w:tc>
+      </w:tr>
+      <w:tr>
+        <w:tc>
+          <w:tcPr>
+            <w:tcW w:type="dxa" w:w="2600"/>
+            <w:tcMar>
+              <w:top w:w="80" w:type="dxa"/>
+              <w:start w:w="120" w:type="dxa"/>
+              <w:bottom w:w="80" w:type="dxa"/>
+              <w:end w:w="120" w:type="dxa"/>
+            </w:tcMar>
+            <w:vAlign w:val="center"/>
+          </w:tcPr>
+          <w:p>
+            <w:pPr>
+              <w:spacing w:after="0"/>
+            </w:pPr>
+            <w:r/>
+            <w:r>
+              <w:rPr>
+                <w:rFonts w:ascii="Calibri" w:hAnsi="Calibri"/>
+                <w:b w:val="0"/>
+                <w:color w:val="1A1F26"/>
+                <w:sz w:val="18"/>
+              </w:rPr>
               <w:t>dac0-output-source</w:t>
             </w:r>
           </w:p>
@@ -1812,18 +1930,8 @@
             <w:vAlign w:val="center"/>
           </w:tcPr>
           <w:p>
-            <w:pPr>
-              <w:spacing w:after="0"/>
-            </w:pPr>
-            <w:r/>
             <w:r>
-              <w:rPr>
-                <w:rFonts w:ascii="Calibri" w:hAnsi="Calibri"/>
-                <w:b w:val="0"/>
-                <w:color w:val="1A1F26"/>
-                <w:sz w:val="18"/>
-              </w:rPr>
-              <w:t>dac1-output-source</w:t>
+              <w:t>pressure-part-number</w:t>
             </w:r>
           </w:p>
         </w:tc>
@@ -1839,18 +1947,8 @@
             <w:vAlign w:val="center"/>
           </w:tcPr>
           <w:p>
-            <w:pPr>
-              <w:spacing w:after="0"/>
-            </w:pPr>
-            <w:r/>
             <w:r>
-              <w:rPr>
-                <w:rFonts w:ascii="Calibri" w:hAnsi="Calibri"/>
-                <w:b w:val="0"/>
-                <w:color w:val="1A1F26"/>
-                <w:sz w:val="18"/>
-              </w:rPr>
-              <w:t>Documents GP8302 DAC1 source on i2c2</w:t>
+              <w:t>Documents the selected pressure sensor</w:t>
             </w:r>
           </w:p>
         </w:tc>
@@ -1866,18 +1964,220 @@
             <w:vAlign w:val="center"/>
           </w:tcPr>
           <w:p>
-            <w:pPr>
-              <w:spacing w:after="0"/>
-            </w:pPr>
-            <w:r/>
             <w:r>
-              <w:rPr>
-                <w:rFonts w:ascii="Calibri" w:hAnsi="Calibri"/>
-                <w:b w:val="0"/>
-                <w:color w:val="1A1F26"/>
-                <w:sz w:val="18"/>
-              </w:rPr>
-              <w:t>pressure</w:t>
+              <w:t>MS580305BA01-00</w:t>
+            </w:r>
+          </w:p>
+        </w:tc>
+      </w:tr>
+      <w:tr>
+        <w:tc>
+          <w:tcPr>
+            <w:tcW w:type="dxa" w:w="2600"/>
+            <w:tcMar>
+              <w:top w:w="80" w:type="dxa"/>
+              <w:start w:w="120" w:type="dxa"/>
+              <w:bottom w:w="80" w:type="dxa"/>
+              <w:end w:w="120" w:type="dxa"/>
+            </w:tcMar>
+            <w:vAlign w:val="center"/>
+          </w:tcPr>
+          <w:p>
+            <w:r>
+              <w:t>pressure-interface</w:t>
+            </w:r>
+          </w:p>
+        </w:tc>
+        <w:tc>
+          <w:tcPr>
+            <w:tcW w:type="dxa" w:w="3860"/>
+            <w:tcMar>
+              <w:top w:w="80" w:type="dxa"/>
+              <w:start w:w="120" w:type="dxa"/>
+              <w:bottom w:w="80" w:type="dxa"/>
+              <w:end w:w="120" w:type="dxa"/>
+            </w:tcMar>
+            <w:vAlign w:val="center"/>
+          </w:tcPr>
+          <w:p>
+            <w:r>
+              <w:t>Documents the selected pressure sensor bus</w:t>
+            </w:r>
+          </w:p>
+        </w:tc>
+        <w:tc>
+          <w:tcPr>
+            <w:tcW w:type="dxa" w:w="2900"/>
+            <w:tcMar>
+              <w:top w:w="80" w:type="dxa"/>
+              <w:start w:w="120" w:type="dxa"/>
+              <w:bottom w:w="80" w:type="dxa"/>
+              <w:end w:w="120" w:type="dxa"/>
+            </w:tcMar>
+            <w:vAlign w:val="center"/>
+          </w:tcPr>
+          <w:p>
+            <w:r>
+              <w:t>spi</w:t>
+            </w:r>
+          </w:p>
+        </w:tc>
+      </w:tr>
+      <w:tr>
+        <w:tc>
+          <w:tcPr>
+            <w:tcW w:type="dxa" w:w="2600"/>
+            <w:tcMar>
+              <w:top w:w="80" w:type="dxa"/>
+              <w:start w:w="120" w:type="dxa"/>
+              <w:bottom w:w="80" w:type="dxa"/>
+              <w:end w:w="120" w:type="dxa"/>
+            </w:tcMar>
+            <w:vAlign w:val="center"/>
+          </w:tcPr>
+          <w:p>
+            <w:r>
+              <w:t>pressure-ps-active-state</w:t>
+            </w:r>
+          </w:p>
+        </w:tc>
+        <w:tc>
+          <w:tcPr>
+            <w:tcW w:type="dxa" w:w="3860"/>
+            <w:tcMar>
+              <w:top w:w="80" w:type="dxa"/>
+              <w:start w:w="120" w:type="dxa"/>
+              <w:bottom w:w="80" w:type="dxa"/>
+              <w:end w:w="120" w:type="dxa"/>
+            </w:tcMar>
+            <w:vAlign w:val="center"/>
+          </w:tcPr>
+          <w:p>
+            <w:r>
+              <w:t>Documents protocol-select polarity for the selected pressure sensor</w:t>
+            </w:r>
+          </w:p>
+        </w:tc>
+        <w:tc>
+          <w:tcPr>
+            <w:tcW w:type="dxa" w:w="2900"/>
+            <w:tcMar>
+              <w:top w:w="80" w:type="dxa"/>
+              <w:start w:w="120" w:type="dxa"/>
+              <w:bottom w:w="80" w:type="dxa"/>
+              <w:end w:w="120" w:type="dxa"/>
+            </w:tcMar>
+            <w:vAlign w:val="center"/>
+          </w:tcPr>
+          <w:p>
+            <w:r>
+              <w:t>low</w:t>
+            </w:r>
+          </w:p>
+        </w:tc>
+      </w:tr>
+      <w:tr>
+        <w:tc>
+          <w:tcPr>
+            <w:tcW w:type="dxa" w:w="2600"/>
+            <w:tcMar>
+              <w:top w:w="80" w:type="dxa"/>
+              <w:start w:w="120" w:type="dxa"/>
+              <w:bottom w:w="80" w:type="dxa"/>
+              <w:end w:w="120" w:type="dxa"/>
+            </w:tcMar>
+            <w:vAlign w:val="center"/>
+          </w:tcPr>
+          <w:p>
+            <w:r>
+              <w:t>humidity-part-number</w:t>
+            </w:r>
+          </w:p>
+        </w:tc>
+        <w:tc>
+          <w:tcPr>
+            <w:tcW w:type="dxa" w:w="3860"/>
+            <w:tcMar>
+              <w:top w:w="80" w:type="dxa"/>
+              <w:start w:w="120" w:type="dxa"/>
+              <w:bottom w:w="80" w:type="dxa"/>
+              <w:end w:w="120" w:type="dxa"/>
+            </w:tcMar>
+            <w:vAlign w:val="center"/>
+          </w:tcPr>
+          <w:p>
+            <w:r>
+              <w:t>Documents the selected humidity sensor</w:t>
+            </w:r>
+          </w:p>
+        </w:tc>
+        <w:tc>
+          <w:tcPr>
+            <w:tcW w:type="dxa" w:w="2900"/>
+            <w:tcMar>
+              <w:top w:w="80" w:type="dxa"/>
+              <w:start w:w="120" w:type="dxa"/>
+              <w:bottom w:w="80" w:type="dxa"/>
+              <w:end w:w="120" w:type="dxa"/>
+            </w:tcMar>
+            <w:vAlign w:val="center"/>
+          </w:tcPr>
+          <w:p>
+            <w:r>
+              <w:t>HTU21D</w:t>
+            </w:r>
+          </w:p>
+        </w:tc>
+      </w:tr>
+      <w:tr>
+        <w:tc>
+          <w:tcPr>
+            <w:tcW w:type="dxa" w:w="2600"/>
+            <w:tcMar>
+              <w:top w:w="80" w:type="dxa"/>
+              <w:start w:w="120" w:type="dxa"/>
+              <w:bottom w:w="80" w:type="dxa"/>
+              <w:end w:w="120" w:type="dxa"/>
+            </w:tcMar>
+            <w:vAlign w:val="center"/>
+          </w:tcPr>
+          <w:p>
+            <w:r>
+              <w:t>humidity-interface</w:t>
+            </w:r>
+          </w:p>
+        </w:tc>
+        <w:tc>
+          <w:tcPr>
+            <w:tcW w:type="dxa" w:w="3860"/>
+            <w:tcMar>
+              <w:top w:w="80" w:type="dxa"/>
+              <w:start w:w="120" w:type="dxa"/>
+              <w:bottom w:w="80" w:type="dxa"/>
+              <w:end w:w="120" w:type="dxa"/>
+            </w:tcMar>
+            <w:vAlign w:val="center"/>
+          </w:tcPr>
+          <w:p>
+            <w:r>
+              <w:t>Documents the selected humidity sensor bus</w:t>
+            </w:r>
+          </w:p>
+        </w:tc>
+        <w:tc>
+          <w:tcPr>
+            <w:tcW w:type="dxa" w:w="2900"/>
+            <w:tcMar>
+              <w:top w:w="80" w:type="dxa"/>
+              <w:start w:w="120" w:type="dxa"/>
+              <w:bottom w:w="80" w:type="dxa"/>
+              <w:end w:w="120" w:type="dxa"/>
+            </w:tcMar>
+            <w:vAlign w:val="center"/>
+          </w:tcPr>
+          <w:p>
+            <w:r>
+              <w:t>i2c2</w:t>
             </w:r>
           </w:p>
         </w:tc>
@@ -2337,18 +2637,8 @@
             <w:vAlign w:val="center"/>
           </w:tcPr>
           <w:p>
-            <w:pPr>
-              <w:spacing w:after="0"/>
-            </w:pPr>
-            <w:r/>
             <w:r>
-              <w:rPr>
-                <w:rFonts w:ascii="Calibri" w:hAnsi="Calibri"/>
-                <w:b w:val="0"/>
-                <w:color w:val="1A1F26"/>
-                <w:sz w:val="18"/>
-              </w:rPr>
-              <w:t>Selects pressure sensor protocol/mode</w:t>
+              <w:t>MS5803 protocol select, low = SPI and high = I2C</w:t>
             </w:r>
           </w:p>
         </w:tc>
@@ -2364,18 +2654,8 @@
             <w:vAlign w:val="center"/>
           </w:tcPr>
           <w:p>
-            <w:pPr>
-              <w:spacing w:after="0"/>
-            </w:pPr>
-            <w:r/>
             <w:r>
-              <w:rPr>
-                <w:rFonts w:ascii="Calibri" w:hAnsi="Calibri"/>
-                <w:b w:val="0"/>
-                <w:color w:val="1A1F26"/>
-                <w:sz w:val="18"/>
-              </w:rPr>
-              <w:t>Configurable</w:t>
+              <w:t>Low during SPI measurements</w:t>
             </w:r>
           </w:p>
         </w:tc>
@@ -3787,6 +4067,14 @@
         <w:pStyle w:val="CodeBlock"/>
       </w:pPr>
       <w:r>
+        <w:t>CONFIG_ARGISENSE_PRE_RAIL_ALWAYS_ON</w:t>
+      </w:r>
+    </w:p>
+    <w:p>
+      <w:pPr>
+        <w:pStyle w:val="CodeBlock"/>
+      </w:pPr>
+      <w:r>
         <w:rPr>
           <w:rFonts w:ascii="Courier New" w:hAnsi="Courier New"/>
           <w:color w:val="232D3A"/>
@@ -3917,6 +4205,30 @@
         <w:pStyle w:val="CodeBlock"/>
       </w:pPr>
       <w:r>
+        <w:t>CONFIG_ARGISENSE_METHANE_SENSOR_WARMUP_SECONDS</w:t>
+      </w:r>
+    </w:p>
+    <w:p>
+      <w:pPr>
+        <w:pStyle w:val="CodeBlock"/>
+      </w:pPr>
+      <w:r>
+        <w:t>CONFIG_ARGISENSE_METHANE_SENSOR_READ_PERIOD_MS</w:t>
+      </w:r>
+    </w:p>
+    <w:p>
+      <w:pPr>
+        <w:pStyle w:val="CodeBlock"/>
+      </w:pPr>
+      <w:r>
+        <w:t>CONFIG_ARGISENSE_HUMIDITY_SENSOR_READ_PERIOD_SECONDS</w:t>
+      </w:r>
+    </w:p>
+    <w:p>
+      <w:pPr>
+        <w:pStyle w:val="CodeBlock"/>
+      </w:pPr>
+      <w:r>
         <w:rPr>
           <w:rFonts w:ascii="Courier New" w:hAnsi="Courier New"/>
           <w:color w:val="232D3A"/>
@@ -3947,16 +4259,161 @@
       </w:r>
     </w:p>
     <w:p>
+      <w:pPr/>
+      <w:r>
+        <w:t>The methane sensor should be treated as invalid during warm-up or after a UART timeout. The RS485 status map and 4-20 mA fault behavior must expose this state. The detailed integration note is in docs/dynament-platinum-methane.md.</w:t>
+      </w:r>
+    </w:p>
+    <w:p>
+      <w:pPr>
+        <w:pStyle w:val="ListBullet"/>
+      </w:pPr>
+      <w:r>
+        <w:t>Track methane concentration, percent volume, Dynament status flags, warm-up state, last successful read timestamp, and communication error counter.</w:t>
+      </w:r>
+    </w:p>
+    <w:p>
+      <w:pPr>
+        <w:pStyle w:val="ListBullet"/>
+      </w:pPr>
+      <w:r>
+        <w:t>Use a read timeout so the measurement loop cannot hang.</w:t>
+      </w:r>
+    </w:p>
+    <w:p>
+      <w:pPr>
+        <w:pStyle w:val="ListBullet"/>
+      </w:pPr>
+      <w:r>
+        <w:t>Handle Dynament byte-stuffed DLE/control characters in the final UART stream parser before decoding the compact frame.</w:t>
+      </w:r>
+    </w:p>
+    <w:p>
+      <w:pPr>
+        <w:pStyle w:val="ListBullet"/>
+      </w:pPr>
+      <w:r>
+        <w:t>Treat the gas reading as percent volume and convert it to ppm_x100 with: ppm_x100 = percent_volume * 1,000,000.</w:t>
+      </w:r>
+    </w:p>
+    <w:p>
+      <w:pPr>
+        <w:pStyle w:val="ListBullet"/>
+      </w:pPr>
+      <w:r>
+        <w:t>Parse the compact response as DLE + DAT, data length, little-endian version, little-endian status flags, little-endian IEEE-754 gas reading, DLE + EOF, and high/low additive checksum.</w:t>
+      </w:r>
+    </w:p>
+    <w:p>
+      <w:pPr>
+        <w:pStyle w:val="ListBullet"/>
+      </w:pPr>
+      <w:r>
+        <w:t>Send the AN0007 live-data-simple request: 10 13 06 10 1F 00 58.</w:t>
+      </w:r>
+    </w:p>
+    <w:p>
+      <w:pPr>
+        <w:pStyle w:val="ListBullet"/>
+      </w:pPr>
+      <w:r>
+        <w:t>Allow up to 60 seconds after first power before trusting gas readings. During warm-up or fault conditions, the live data can report -250.</w:t>
+      </w:r>
+    </w:p>
+    <w:p>
+      <w:pPr>
+        <w:pStyle w:val="ListBullet"/>
+      </w:pPr>
+      <w:r>
+        <w:t>Keep the sensor powered continuously by default because the Dynament Platinum sensor is intended for continuous powered operation.</w:t>
+      </w:r>
+    </w:p>
+    <w:p>
+      <w:pPr/>
+      <w:r>
+        <w:t>Recommended behavior:</w:t>
+      </w:r>
+    </w:p>
+    <w:p>
+      <w:pPr/>
+      <w:r>
+        <w:t>The selected methane sensor family is the Dynament Platinum Series Hydrocarbon infrared gas sensor. It is connected to uart4 at 38400 baud using 8 data bits, 1 stop bit, and no parity. The board DTS declares it as argisense,dynament-platinum-hydrocarbon.</w:t>
+      </w:r>
+    </w:p>
+    <w:p>
+      <w:pPr>
+        <w:pStyle w:val="ListBullet"/>
+      </w:pPr>
+      <w:r>
+        <w:t>Treat humidity as auxiliary process data; it does not drive either 4-20 mA output by default.</w:t>
+      </w:r>
+    </w:p>
+    <w:p>
+      <w:pPr>
+        <w:pStyle w:val="ListBullet"/>
+      </w:pPr>
+      <w:r>
+        <w:t>Expose humidity communication errors in the RS485 status map.</w:t>
+      </w:r>
+    </w:p>
+    <w:p>
+      <w:pPr>
+        <w:pStyle w:val="ListBullet"/>
+      </w:pPr>
+      <w:r>
+        <w:t>Store relative humidity as %RH x100 and ambient temperature as millidegrees Celsius in the central data model.</w:t>
+      </w:r>
+    </w:p>
+    <w:p>
+      <w:pPr>
+        <w:pStyle w:val="ListBullet"/>
+      </w:pPr>
+      <w:r>
+        <w:t>Use CONFIG_ARGISENSE_HUMIDITY_SENSOR_READ_PERIOD_SECONDS to avoid reading humidity more often than needed.</w:t>
+      </w:r>
+    </w:p>
+    <w:p>
+      <w:pPr>
+        <w:pStyle w:val="ListBullet"/>
+      </w:pPr>
+      <w:r>
+        <w:t>Fetch SENSOR_CHAN_HUMIDITY and SENSOR_CHAN_AMBIENT_TEMP after the I2C bus is ready.</w:t>
+      </w:r>
+    </w:p>
+    <w:p>
+      <w:pPr/>
+      <w:r>
+        <w:t>Recommended behavior:</w:t>
+      </w:r>
+    </w:p>
+    <w:p>
+      <w:pPr/>
+      <w:r>
+        <w:t>The selected humidity sensor is HTU21D. It is connected to i2c2 at address 0x40. Zephyr 4.4 uses the built-in SHT21-compatible driver path for this part, with DTS compatible sensirion,sht21 and CONFIG_SENSOR enabled.</w:t>
+      </w:r>
+    </w:p>
+    <w:p>
+      <w:pPr>
+        <w:pStyle w:val="Heading1"/>
+      </w:pPr>
+      <w:r>
+        <w:t>Humidity Sensor Handling</w:t>
+      </w:r>
+    </w:p>
+    <w:p>
+      <w:pPr>
+        <w:pStyle w:val="Heading1"/>
+      </w:pPr>
+      <w:r>
+        <w:t>Pressure Sensor Handling</w:t>
+      </w:r>
+    </w:p>
+    <w:p>
       <w:pPr>
         <w:spacing w:after="120"/>
       </w:pPr>
       <w:r>
-        <w:rPr>
-          <w:rFonts w:ascii="Calibri" w:hAnsi="Calibri"/>
-          <w:color w:val="1A1F26"/>
-          <w:sz w:val="21"/>
-        </w:rPr>
-        <w:t>The methane sensor is connected to uart4.</w:t>
+        <w:t>The selected pressure sensor is TE Connectivity MS580305BA01-00 (MS5803-05BA01). It is a 5 bar / 500 kPa absolute digital pressure sensor with a 24-bit ADC and SPI/I2C digital interface. The argisense_mp_u575rg board uses SPI on spi1 with GPIO chip select on PA4, so the firmware keeps the sensor PS pin low during measurement windows.</w:t>
       </w:r>
     </w:p>
     <w:p>
@@ -3978,15 +4435,7 @@
         <w:spacing w:after="80"/>
       </w:pPr>
       <w:r>
-        <w:rPr>
-          <w:rFonts w:ascii="Calibri" w:hAnsi="Calibri"/>
-          <w:color w:val="1A1F26"/>
-          <w:sz w:val="20"/>
-        </w:rPr>
-        <w:t>Default to the sensor module's required baud rate. The current DTS default is</w:t>
-      </w:r>
-      <w:r>
-        <w:t xml:space="preserve"> 9600 baud.</w:t>
+        <w:t>Keep pressure-ps-gpios low before enabling SPI transactions.</w:t>
       </w:r>
     </w:p>
     <w:p>
@@ -3995,12 +4444,7 @@
         <w:spacing w:after="80"/>
       </w:pPr>
       <w:r>
-        <w:rPr>
-          <w:rFonts w:ascii="Calibri" w:hAnsi="Calibri"/>
-          <w:color w:val="1A1F26"/>
-          <w:sz w:val="20"/>
-        </w:rPr>
-        <w:t>Add a frame parser specific to the selected methane module.</w:t>
+        <w:t>Send the MS5803 reset command before the first calibration read.</w:t>
       </w:r>
     </w:p>
     <w:p>
@@ -4009,212 +4453,39 @@
         <w:spacing w:after="80"/>
       </w:pPr>
       <w:r>
-        <w:rPr>
-          <w:rFonts w:ascii="Calibri" w:hAnsi="Calibri"/>
-          <w:color w:val="1A1F26"/>
-          <w:sz w:val="20"/>
-        </w:rPr>
-        <w:t>Use a read timeout so the measurement loop cannot hang.</w:t>
+        <w:t>Read PROM calibration coefficients and verify the PROM CRC.</w:t>
       </w:r>
     </w:p>
     <w:p>
       <w:pPr>
         <w:pStyle w:val="ListBullet"/>
-        <w:spacing w:after="80"/>
       </w:pPr>
       <w:r>
-        <w:rPr>
-          <w:rFonts w:ascii="Calibri" w:hAnsi="Calibri"/>
-          <w:color w:val="1A1F26"/>
-          <w:sz w:val="20"/>
-        </w:rPr>
-        <w:t>Track these fields in the data model:</w:t>
+        <w:t>Start D1 pressure conversion and D2 temperature conversion with the selected oversampling ratio.</w:t>
       </w:r>
     </w:p>
     <w:p>
       <w:pPr>
         <w:pStyle w:val="ListBullet"/>
-        <w:spacing w:after="80"/>
       </w:pPr>
       <w:r>
-        <w:rPr>
-          <w:rFonts w:ascii="Calibri" w:hAnsi="Calibri"/>
-          <w:color w:val="1A1F26"/>
-          <w:sz w:val="20"/>
-        </w:rPr>
-        <w:t>methane concentration</w:t>
+        <w:t>Wait the datasheet conversion time before reading the 24-bit ADC result.</w:t>
       </w:r>
     </w:p>
     <w:p>
       <w:pPr>
         <w:pStyle w:val="ListBullet"/>
-        <w:spacing w:after="80"/>
       </w:pPr>
       <w:r>
-        <w:rPr>
-          <w:rFonts w:ascii="Calibri" w:hAnsi="Calibri"/>
-          <w:color w:val="1A1F26"/>
-          <w:sz w:val="20"/>
-        </w:rPr>
-        <w:t>methane unit</w:t>
+        <w:t>Apply the MS5803 first-order and second-order compensation equations before publishing pressure.</w:t>
       </w:r>
     </w:p>
     <w:p>
       <w:pPr>
         <w:pStyle w:val="ListBullet"/>
-        <w:spacing w:after="80"/>
       </w:pPr>
       <w:r>
-        <w:rPr>
-          <w:rFonts w:ascii="Calibri" w:hAnsi="Calibri"/>
-          <w:color w:val="1A1F26"/>
-          <w:sz w:val="20"/>
-        </w:rPr>
-        <w:t>sensor status</w:t>
-      </w:r>
-    </w:p>
-    <w:p>
-      <w:pPr>
-        <w:pStyle w:val="ListBullet"/>
-        <w:spacing w:after="80"/>
-      </w:pPr>
-      <w:r>
-        <w:rPr>
-          <w:rFonts w:ascii="Calibri" w:hAnsi="Calibri"/>
-          <w:color w:val="1A1F26"/>
-          <w:sz w:val="20"/>
-        </w:rPr>
-        <w:t>warm-up state</w:t>
-      </w:r>
-    </w:p>
-    <w:p>
-      <w:pPr>
-        <w:pStyle w:val="ListBullet"/>
-        <w:spacing w:after="80"/>
-      </w:pPr>
-      <w:r>
-        <w:rPr>
-          <w:rFonts w:ascii="Calibri" w:hAnsi="Calibri"/>
-          <w:color w:val="1A1F26"/>
-          <w:sz w:val="20"/>
-        </w:rPr>
-        <w:t>last successful read timestamp</w:t>
-      </w:r>
-    </w:p>
-    <w:p>
-      <w:pPr>
-        <w:pStyle w:val="ListBullet"/>
-        <w:spacing w:after="80"/>
-      </w:pPr>
-      <w:r>
-        <w:rPr>
-          <w:rFonts w:ascii="Calibri" w:hAnsi="Calibri"/>
-          <w:color w:val="1A1F26"/>
-          <w:sz w:val="20"/>
-        </w:rPr>
-        <w:t>communication error counter</w:t>
-      </w:r>
-    </w:p>
-    <w:p>
-      <w:pPr>
-        <w:spacing w:after="120"/>
-      </w:pPr>
-      <w:r>
-        <w:rPr>
-          <w:rFonts w:ascii="Calibri" w:hAnsi="Calibri"/>
-          <w:color w:val="1A1F26"/>
-          <w:sz w:val="21"/>
-        </w:rPr>
-        <w:t>The methane sensor should be treated as invalid during warm-up or after a UART</w:t>
-      </w:r>
-    </w:p>
-    <w:p>
-      <w:pPr>
-        <w:spacing w:after="120"/>
-      </w:pPr>
-      <w:r>
-        <w:rPr>
-          <w:rFonts w:ascii="Calibri" w:hAnsi="Calibri"/>
-          <w:color w:val="1A1F26"/>
-          <w:sz w:val="21"/>
-        </w:rPr>
-        <w:t>timeout. The RS485 status map and 4-20 mA fault behavior must expose this state.</w:t>
-      </w:r>
-    </w:p>
-    <w:p>
-      <w:pPr>
-        <w:pStyle w:val="Heading1"/>
-      </w:pPr>
-      <w:r>
-        <w:t>Pressure Sensor Handling</w:t>
-      </w:r>
-    </w:p>
-    <w:p>
-      <w:pPr>
-        <w:spacing w:after="120"/>
-      </w:pPr>
-      <w:r>
-        <w:rPr>
-          <w:rFonts w:ascii="Calibri" w:hAnsi="Calibri"/>
-          <w:color w:val="1A1F26"/>
-          <w:sz w:val="21"/>
-        </w:rPr>
-        <w:t>The pressure sensor is connected to spi1 with GPIO chip select on PA4.</w:t>
-      </w:r>
-    </w:p>
-    <w:p>
-      <w:pPr>
-        <w:spacing w:after="120"/>
-      </w:pPr>
-      <w:r>
-        <w:rPr>
-          <w:rFonts w:ascii="Calibri" w:hAnsi="Calibri"/>
-          <w:color w:val="1A1F26"/>
-          <w:sz w:val="21"/>
-        </w:rPr>
-        <w:t>Recommended behavior:</w:t>
-      </w:r>
-    </w:p>
-    <w:p>
-      <w:pPr>
-        <w:pStyle w:val="ListBullet"/>
-        <w:spacing w:after="80"/>
-      </w:pPr>
-      <w:r>
-        <w:rPr>
-          <w:rFonts w:ascii="Calibri" w:hAnsi="Calibri"/>
-          <w:color w:val="1A1F26"/>
-          <w:sz w:val="20"/>
-        </w:rPr>
-        <w:t>Use SPI mode unless the selected pressure sensor datasheet requires I2C.</w:t>
-      </w:r>
-    </w:p>
-    <w:p>
-      <w:pPr>
-        <w:pStyle w:val="ListBullet"/>
-        <w:spacing w:after="80"/>
-      </w:pPr>
-      <w:r>
-        <w:rPr>
-          <w:rFonts w:ascii="Calibri" w:hAnsi="Calibri"/>
-          <w:color w:val="1A1F26"/>
-          <w:sz w:val="20"/>
-        </w:rPr>
-        <w:t>Keep pressure-ps-gpios deterministic before enabling transactions.</w:t>
-      </w:r>
-    </w:p>
-    <w:p>
-      <w:pPr>
-        <w:pStyle w:val="ListBullet"/>
-        <w:spacing w:after="80"/>
-      </w:pPr>
-      <w:r>
-        <w:rPr>
-          <w:rFonts w:ascii="Calibri" w:hAnsi="Calibri"/>
-          <w:color w:val="1A1F26"/>
-          <w:sz w:val="20"/>
-        </w:rPr>
-        <w:t>Add sensor-specific compensation in the pressure driver.</w:t>
+        <w:t>Use pascals in the firmware data model and RS485 register map.</w:t>
       </w:r>
     </w:p>
     <w:p>
@@ -5043,6 +5314,18 @@
       </w:tr>
     </w:tbl>
     <w:p/>
+    <w:p>
+      <w:pPr/>
+      <w:r>
+        <w:t>The default methane DAC range is 0 ppm to 1000000 ppm, matching a 0-100% volume Dynament methane variant. For a 0-5% volume ordered variant, set the high point to 50000 ppm.</w:t>
+      </w:r>
+    </w:p>
+    <w:p>
+      <w:pPr/>
+      <w:r>
+        <w:t>For the selected MS580305BA01-00 pressure sensor, the default pressure DAC range is 0 Pa to 500000 Pa, matching the nominal 5 bar absolute sensor range.</w:t>
+      </w:r>
+    </w:p>
     <w:p>
       <w:pPr>
         <w:spacing w:after="120"/>
@@ -6557,6 +6840,89 @@
                 <w:color w:val="1A1F26"/>
                 <w:sz w:val="18"/>
               </w:rPr>
+              <w:t>0x0021</w:t>
+            </w:r>
+          </w:p>
+        </w:tc>
+        <w:tc>
+          <w:tcPr>
+            <w:tcW w:type="dxa" w:w="3860"/>
+            <w:tcMar>
+              <w:top w:w="80" w:type="dxa"/>
+              <w:start w:w="120" w:type="dxa"/>
+              <w:bottom w:w="80" w:type="dxa"/>
+              <w:end w:w="120" w:type="dxa"/>
+            </w:tcMar>
+            <w:vAlign w:val="center"/>
+          </w:tcPr>
+          <w:p>
+            <w:pPr>
+              <w:spacing w:after="0"/>
+            </w:pPr>
+            <w:r/>
+            <w:r>
+              <w:rPr>
+                <w:rFonts w:ascii="Calibri" w:hAnsi="Calibri"/>
+                <w:b w:val="0"/>
+                <w:color w:val="1A1F26"/>
+                <w:sz w:val="18"/>
+              </w:rPr>
+              <w:t>Input</w:t>
+            </w:r>
+          </w:p>
+        </w:tc>
+        <w:tc>
+          <w:tcPr>
+            <w:tcW w:type="dxa" w:w="2900"/>
+            <w:tcMar>
+              <w:top w:w="80" w:type="dxa"/>
+              <w:start w:w="120" w:type="dxa"/>
+              <w:bottom w:w="80" w:type="dxa"/>
+              <w:end w:w="120" w:type="dxa"/>
+            </w:tcMar>
+            <w:vAlign w:val="center"/>
+          </w:tcPr>
+          <w:p>
+            <w:pPr>
+              <w:spacing w:after="0"/>
+            </w:pPr>
+            <w:r/>
+            <w:r>
+              <w:rPr>
+                <w:rFonts w:ascii="Calibri" w:hAnsi="Calibri"/>
+                <w:b w:val="0"/>
+                <w:color w:val="1A1F26"/>
+                <w:sz w:val="18"/>
+              </w:rPr>
+              <w:t>Pressure status</w:t>
+            </w:r>
+          </w:p>
+        </w:tc>
+      </w:tr>
+      <w:tr>
+        <w:tc>
+          <w:tcPr>
+            <w:tcW w:type="dxa" w:w="2600"/>
+            <w:tcMar>
+              <w:top w:w="80" w:type="dxa"/>
+              <w:start w:w="120" w:type="dxa"/>
+              <w:bottom w:w="80" w:type="dxa"/>
+              <w:end w:w="120" w:type="dxa"/>
+            </w:tcMar>
+            <w:vAlign w:val="center"/>
+          </w:tcPr>
+          <w:p>
+            <w:pPr>
+              <w:spacing w:after="0"/>
+            </w:pPr>
+            <w:r/>
+            <w:r>
+              <w:rPr>
+                <w:rFonts w:ascii="Calibri" w:hAnsi="Calibri"/>
+                <w:b w:val="0"/>
+                <w:color w:val="1A1F26"/>
+                <w:sz w:val="18"/>
+              </w:rPr>
               <w:t>0x0020</w:t>
             </w:r>
           </w:p>
@@ -6629,18 +6995,8 @@
             <w:vAlign w:val="center"/>
           </w:tcPr>
           <w:p>
-            <w:pPr>
-              <w:spacing w:after="0"/>
-            </w:pPr>
-            <w:r/>
             <w:r>
-              <w:rPr>
-                <w:rFonts w:ascii="Calibri" w:hAnsi="Calibri"/>
-                <w:b w:val="0"/>
-                <w:color w:val="1A1F26"/>
-                <w:sz w:val="18"/>
-              </w:rPr>
-              <w:t>0x0021</w:t>
+              <w:t>0x0028</w:t>
             </w:r>
           </w:p>
         </w:tc>
@@ -6656,17 +7012,7 @@
             <w:vAlign w:val="center"/>
           </w:tcPr>
           <w:p>
-            <w:pPr>
-              <w:spacing w:after="0"/>
-            </w:pPr>
-            <w:r/>
             <w:r>
-              <w:rPr>
-                <w:rFonts w:ascii="Calibri" w:hAnsi="Calibri"/>
-                <w:b w:val="0"/>
-                <w:color w:val="1A1F26"/>
-                <w:sz w:val="18"/>
-              </w:rPr>
               <w:t>Input</w:t>
             </w:r>
           </w:p>
@@ -6683,18 +7029,114 @@
             <w:vAlign w:val="center"/>
           </w:tcPr>
           <w:p>
-            <w:pPr>
-              <w:spacing w:after="0"/>
-            </w:pPr>
-            <w:r/>
             <w:r>
-              <w:rPr>
-                <w:rFonts w:ascii="Calibri" w:hAnsi="Calibri"/>
-                <w:b w:val="0"/>
-                <w:color w:val="1A1F26"/>
-                <w:sz w:val="18"/>
-              </w:rPr>
-              <w:t>Pressure status</w:t>
+              <w:t>Relative humidity, %RH x100</w:t>
+            </w:r>
+          </w:p>
+        </w:tc>
+      </w:tr>
+      <w:tr>
+        <w:tc>
+          <w:tcPr>
+            <w:tcW w:type="dxa" w:w="2600"/>
+            <w:tcMar>
+              <w:top w:w="80" w:type="dxa"/>
+              <w:start w:w="120" w:type="dxa"/>
+              <w:bottom w:w="80" w:type="dxa"/>
+              <w:end w:w="120" w:type="dxa"/>
+            </w:tcMar>
+            <w:vAlign w:val="center"/>
+          </w:tcPr>
+          <w:p>
+            <w:r>
+              <w:t>0x0029</w:t>
+            </w:r>
+          </w:p>
+        </w:tc>
+        <w:tc>
+          <w:tcPr>
+            <w:tcW w:type="dxa" w:w="3860"/>
+            <w:tcMar>
+              <w:top w:w="80" w:type="dxa"/>
+              <w:start w:w="120" w:type="dxa"/>
+              <w:bottom w:w="80" w:type="dxa"/>
+              <w:end w:w="120" w:type="dxa"/>
+            </w:tcMar>
+            <w:vAlign w:val="center"/>
+          </w:tcPr>
+          <w:p>
+            <w:r>
+              <w:t>Input</w:t>
+            </w:r>
+          </w:p>
+        </w:tc>
+        <w:tc>
+          <w:tcPr>
+            <w:tcW w:type="dxa" w:w="2900"/>
+            <w:tcMar>
+              <w:top w:w="80" w:type="dxa"/>
+              <w:start w:w="120" w:type="dxa"/>
+              <w:bottom w:w="80" w:type="dxa"/>
+              <w:end w:w="120" w:type="dxa"/>
+            </w:tcMar>
+            <w:vAlign w:val="center"/>
+          </w:tcPr>
+          <w:p>
+            <w:r>
+              <w:t>HTU21D ambient temperature, millidegrees Celsius</w:t>
+            </w:r>
+          </w:p>
+        </w:tc>
+      </w:tr>
+      <w:tr>
+        <w:tc>
+          <w:tcPr>
+            <w:tcW w:type="dxa" w:w="2600"/>
+            <w:tcMar>
+              <w:top w:w="80" w:type="dxa"/>
+              <w:start w:w="120" w:type="dxa"/>
+              <w:bottom w:w="80" w:type="dxa"/>
+              <w:end w:w="120" w:type="dxa"/>
+            </w:tcMar>
+            <w:vAlign w:val="center"/>
+          </w:tcPr>
+          <w:p>
+            <w:r>
+              <w:t>0x002A</w:t>
+            </w:r>
+          </w:p>
+        </w:tc>
+        <w:tc>
+          <w:tcPr>
+            <w:tcW w:type="dxa" w:w="3860"/>
+            <w:tcMar>
+              <w:top w:w="80" w:type="dxa"/>
+              <w:start w:w="120" w:type="dxa"/>
+              <w:bottom w:w="80" w:type="dxa"/>
+              <w:end w:w="120" w:type="dxa"/>
+            </w:tcMar>
+            <w:vAlign w:val="center"/>
+          </w:tcPr>
+          <w:p>
+            <w:r>
+              <w:t>Input</w:t>
+            </w:r>
+          </w:p>
+        </w:tc>
+        <w:tc>
+          <w:tcPr>
+            <w:tcW w:type="dxa" w:w="2900"/>
+            <w:tcMar>
+              <w:top w:w="80" w:type="dxa"/>
+              <w:start w:w="120" w:type="dxa"/>
+              <w:bottom w:w="80" w:type="dxa"/>
+              <w:end w:w="120" w:type="dxa"/>
+            </w:tcMar>
+            <w:vAlign w:val="center"/>
+          </w:tcPr>
+          <w:p>
+            <w:r>
+              <w:t>Humidity sensor status</w:t>
             </w:r>
           </w:p>
         </w:tc>
@@ -8065,6 +8507,15 @@
         <w:pStyle w:val="CodeBlock"/>
       </w:pPr>
       <w:r>
+        <w:tab/>
+        <w:t>int32_t humidity_rh_x100;</w:t>
+      </w:r>
+    </w:p>
+    <w:p>
+      <w:pPr>
+        <w:pStyle w:val="CodeBlock"/>
+      </w:pPr>
+      <w:r>
         <w:rPr>
           <w:rFonts w:ascii="Courier New" w:hAnsi="Courier New"/>
           <w:color w:val="232D3A"/>
@@ -8287,6 +8738,22 @@
     </w:p>
     <w:p>
       <w:pPr>
+        <w:pStyle w:val="CodeBlock"/>
+      </w:pPr>
+      <w:r>
+        <w:t>BIT(11) humidity_valid</w:t>
+      </w:r>
+    </w:p>
+    <w:p>
+      <w:pPr>
+        <w:pStyle w:val="CodeBlock"/>
+      </w:pPr>
+      <w:r>
+        <w:t>BIT(12) humidity_comm_error</w:t>
+      </w:r>
+    </w:p>
+    <w:p>
+      <w:pPr>
         <w:pStyle w:val="Heading1"/>
       </w:pPr>
       <w:r>
@@ -8294,251 +8761,115 @@
       </w:r>
     </w:p>
     <w:p>
-      <w:pPr>
-        <w:spacing w:after="120"/>
-      </w:pPr>
+      <w:pPr/>
       <w:r>
-        <w:rPr>
-          <w:rFonts w:ascii="Calibri" w:hAnsi="Calibri"/>
-          <w:color w:val="1A1F26"/>
-          <w:sz w:val="21"/>
-        </w:rPr>
-        <w:t>The board should keep only the MCU and always-on support circuitry alive during</w:t>
+        <w:t>Product decision to confirm: whether either 4-20 mA loop must remain driven while the MCU sleeps. If yes, the shared DAC power strategy must change from duty-cycled to continuous or latched-output mode.</w:t>
       </w:r>
     </w:p>
     <w:p>
       <w:pPr>
-        <w:spacing w:after="120"/>
+        <w:pStyle w:val="ListBullet"/>
       </w:pPr>
       <w:r>
-        <w:rPr>
-          <w:rFonts w:ascii="Calibri" w:hAnsi="Calibri"/>
-          <w:color w:val="1A1F26"/>
-          <w:sz w:val="21"/>
-        </w:rPr>
-        <w:t>idle.</w:t>
+        <w:t>Return switched rails to idle state.</w:t>
       </w:r>
     </w:p>
     <w:p>
       <w:pPr>
-        <w:spacing w:after="120"/>
+        <w:pStyle w:val="ListBullet"/>
       </w:pPr>
       <w:r>
-        <w:rPr>
-          <w:rFonts w:ascii="Calibri" w:hAnsi="Calibri"/>
-          <w:color w:val="1A1F26"/>
-          <w:sz w:val="21"/>
-        </w:rPr>
+        <w:t>Update output and communication data.</w:t>
+      </w:r>
+    </w:p>
+    <w:p>
+      <w:pPr>
+        <w:pStyle w:val="ListBullet"/>
+      </w:pPr>
+      <w:r>
+        <w:t>Read sensors.</w:t>
+      </w:r>
+    </w:p>
+    <w:p>
+      <w:pPr>
+        <w:pStyle w:val="ListBullet"/>
+      </w:pPr>
+      <w:r>
+        <w:t>Wait for rails to settle.</w:t>
+      </w:r>
+    </w:p>
+    <w:p>
+      <w:pPr>
+        <w:pStyle w:val="ListBullet"/>
+      </w:pPr>
+      <w:r>
+        <w:t>Ensure the pre-sensor rail is already on or enable it if CONFIG_ARGISENSE_PRE_RAIL_ALWAYS_ON is disabled.</w:t>
+      </w:r>
+    </w:p>
+    <w:p>
+      <w:pPr/>
+      <w:r>
+        <w:t>Measurement state:</w:t>
+      </w:r>
+    </w:p>
+    <w:p>
+      <w:pPr>
+        <w:pStyle w:val="ListBullet"/>
+      </w:pPr>
+      <w:r>
+        <w:t>Zephyr PM allowed to enter STM32U575 STOP idle states.</w:t>
+      </w:r>
+    </w:p>
+    <w:p>
+      <w:pPr>
+        <w:pStyle w:val="ListBullet"/>
+      </w:pPr>
+      <w:r>
+        <w:t>Pressure CS inactive.</w:t>
+      </w:r>
+    </w:p>
+    <w:p>
+      <w:pPr>
+        <w:pStyle w:val="ListBullet"/>
+      </w:pPr>
+      <w:r>
+        <w:t>RS485 termination off unless the installation requires this node to terminate the bus.</w:t>
+      </w:r>
+    </w:p>
+    <w:p>
+      <w:pPr>
+        <w:pStyle w:val="ListBullet"/>
+      </w:pPr>
+      <w:r>
+        <w:t>Shared DAC boost off unless continuous 4-20 mA output is required.</w:t>
+      </w:r>
+    </w:p>
+    <w:p>
+      <w:pPr>
+        <w:pStyle w:val="ListBullet"/>
+      </w:pPr>
+      <w:r>
+        <w:t>Analog rails off.</w:t>
+      </w:r>
+    </w:p>
+    <w:p>
+      <w:pPr>
+        <w:pStyle w:val="ListBullet"/>
+      </w:pPr>
+      <w:r>
+        <w:t>+3V3_PRE on by default for the Dynament methane sensor.</w:t>
+      </w:r>
+    </w:p>
+    <w:p>
+      <w:pPr/>
+      <w:r>
         <w:t>Idle state:</w:t>
       </w:r>
     </w:p>
     <w:p>
-      <w:pPr>
-        <w:pStyle w:val="ListBullet"/>
-        <w:spacing w:after="80"/>
-      </w:pPr>
+      <w:pPr/>
       <w:r>
-        <w:rPr>
-          <w:rFonts w:ascii="Calibri" w:hAnsi="Calibri"/>
-          <w:color w:val="1A1F26"/>
-          <w:sz w:val="20"/>
-        </w:rPr>
-        <w:t>+3V3_PRE off.</w:t>
-      </w:r>
-    </w:p>
-    <w:p>
-      <w:pPr>
-        <w:pStyle w:val="ListBullet"/>
-        <w:spacing w:after="80"/>
-      </w:pPr>
-      <w:r>
-        <w:rPr>
-          <w:rFonts w:ascii="Calibri" w:hAnsi="Calibri"/>
-          <w:color w:val="1A1F26"/>
-          <w:sz w:val="20"/>
-        </w:rPr>
-        <w:t>Analog rails off.</w:t>
-      </w:r>
-    </w:p>
-    <w:p>
-      <w:pPr>
-        <w:pStyle w:val="ListBullet"/>
-        <w:spacing w:after="80"/>
-      </w:pPr>
-      <w:r>
-        <w:rPr>
-          <w:rFonts w:ascii="Calibri" w:hAnsi="Calibri"/>
-          <w:color w:val="1A1F26"/>
-          <w:sz w:val="20"/>
-        </w:rPr>
-        <w:t>Shared DAC boost off unless continuous 4-20 mA output is required.</w:t>
-      </w:r>
-    </w:p>
-    <w:p>
-      <w:pPr>
-        <w:pStyle w:val="ListBullet"/>
-        <w:spacing w:after="80"/>
-      </w:pPr>
-      <w:r>
-        <w:rPr>
-          <w:rFonts w:ascii="Calibri" w:hAnsi="Calibri"/>
-          <w:color w:val="1A1F26"/>
-          <w:sz w:val="20"/>
-        </w:rPr>
-        <w:t>RS485 termination off unless the installation requires this node to terminate</w:t>
-      </w:r>
-      <w:r>
-        <w:t xml:space="preserve"> the bus.</w:t>
-      </w:r>
-    </w:p>
-    <w:p>
-      <w:pPr>
-        <w:pStyle w:val="ListBullet"/>
-        <w:spacing w:after="80"/>
-      </w:pPr>
-      <w:r>
-        <w:rPr>
-          <w:rFonts w:ascii="Calibri" w:hAnsi="Calibri"/>
-          <w:color w:val="1A1F26"/>
-          <w:sz w:val="20"/>
-        </w:rPr>
-        <w:t>Pressure CS inactive.</w:t>
-      </w:r>
-    </w:p>
-    <w:p>
-      <w:pPr>
-        <w:pStyle w:val="ListBullet"/>
-        <w:spacing w:after="80"/>
-      </w:pPr>
-      <w:r>
-        <w:rPr>
-          <w:rFonts w:ascii="Calibri" w:hAnsi="Calibri"/>
-          <w:color w:val="1A1F26"/>
-          <w:sz w:val="20"/>
-        </w:rPr>
-        <w:t>Zephyr PM allowed to enter STM32U575 STOP idle states.</w:t>
-      </w:r>
-    </w:p>
-    <w:p>
-      <w:pPr>
-        <w:spacing w:after="120"/>
-      </w:pPr>
-      <w:r>
-        <w:rPr>
-          <w:rFonts w:ascii="Calibri" w:hAnsi="Calibri"/>
-          <w:color w:val="1A1F26"/>
-          <w:sz w:val="21"/>
-        </w:rPr>
-        <w:t>Measurement state:</w:t>
-      </w:r>
-    </w:p>
-    <w:p>
-      <w:pPr>
-        <w:pStyle w:val="ListBullet"/>
-        <w:spacing w:after="80"/>
-      </w:pPr>
-      <w:r>
-        <w:rPr>
-          <w:rFonts w:ascii="Calibri" w:hAnsi="Calibri"/>
-          <w:color w:val="1A1F26"/>
-          <w:sz w:val="20"/>
-        </w:rPr>
-        <w:t>Enable sensor rails.</w:t>
-      </w:r>
-    </w:p>
-    <w:p>
-      <w:pPr>
-        <w:pStyle w:val="ListBullet"/>
-        <w:spacing w:after="80"/>
-      </w:pPr>
-      <w:r>
-        <w:rPr>
-          <w:rFonts w:ascii="Calibri" w:hAnsi="Calibri"/>
-          <w:color w:val="1A1F26"/>
-          <w:sz w:val="20"/>
-        </w:rPr>
-        <w:t>Wait for rails to settle.</w:t>
-      </w:r>
-    </w:p>
-    <w:p>
-      <w:pPr>
-        <w:pStyle w:val="ListBullet"/>
-        <w:spacing w:after="80"/>
-      </w:pPr>
-      <w:r>
-        <w:rPr>
-          <w:rFonts w:ascii="Calibri" w:hAnsi="Calibri"/>
-          <w:color w:val="1A1F26"/>
-          <w:sz w:val="20"/>
-        </w:rPr>
-        <w:t>Read sensors.</w:t>
-      </w:r>
-    </w:p>
-    <w:p>
-      <w:pPr>
-        <w:pStyle w:val="ListBullet"/>
-        <w:spacing w:after="80"/>
-      </w:pPr>
-      <w:r>
-        <w:rPr>
-          <w:rFonts w:ascii="Calibri" w:hAnsi="Calibri"/>
-          <w:color w:val="1A1F26"/>
-          <w:sz w:val="20"/>
-        </w:rPr>
-        <w:t>Update output and communication data.</w:t>
-      </w:r>
-    </w:p>
-    <w:p>
-      <w:pPr>
-        <w:pStyle w:val="ListBullet"/>
-        <w:spacing w:after="80"/>
-      </w:pPr>
-      <w:r>
-        <w:rPr>
-          <w:rFonts w:ascii="Calibri" w:hAnsi="Calibri"/>
-          <w:color w:val="1A1F26"/>
-          <w:sz w:val="20"/>
-        </w:rPr>
-        <w:t>Return rails to off state.</w:t>
-      </w:r>
-    </w:p>
-    <w:p>
-      <w:pPr>
-        <w:spacing w:after="120"/>
-      </w:pPr>
-      <w:r>
-        <w:rPr>
-          <w:rFonts w:ascii="Calibri" w:hAnsi="Calibri"/>
-          <w:color w:val="1A1F26"/>
-          <w:sz w:val="21"/>
-        </w:rPr>
-        <w:t>Product decision to confirm: whether either 4-20 mA loop must remain driven</w:t>
-      </w:r>
-    </w:p>
-    <w:p>
-      <w:pPr>
-        <w:spacing w:after="120"/>
-      </w:pPr>
-      <w:r>
-        <w:rPr>
-          <w:rFonts w:ascii="Calibri" w:hAnsi="Calibri"/>
-          <w:color w:val="1A1F26"/>
-          <w:sz w:val="21"/>
-        </w:rPr>
-        <w:t>while the MCU sleeps. If yes, the shared DAC power strategy must change from</w:t>
-      </w:r>
-    </w:p>
-    <w:p>
-      <w:pPr>
-        <w:spacing w:after="120"/>
-      </w:pPr>
-      <w:r>
-        <w:rPr>
-          <w:rFonts w:ascii="Calibri" w:hAnsi="Calibri"/>
-          <w:color w:val="1A1F26"/>
-          <w:sz w:val="21"/>
-        </w:rPr>
-        <w:t>duty-cycled to continuous or latched-output mode.</w:t>
+        <w:t>The board should keep only the MCU, always-on support circuitry, and the Dynament methane sensor rail alive during idle by default.</w:t>
       </w:r>
     </w:p>
     <w:p>
@@ -8890,26 +9221,24 @@
         <w:spacing w:after="80"/>
       </w:pPr>
       <w:r>
-        <w:rPr>
-          <w:rFonts w:ascii="Calibri" w:hAnsi="Calibri"/>
-          <w:color w:val="1A1F26"/>
-          <w:sz w:val="20"/>
-        </w:rPr>
-        <w:t>Add simple UART receive test for methane sensor.</w:t>
+        <w:t>Add Dynament live-data-simple UART request and parser smoke test.</w:t>
       </w:r>
     </w:p>
     <w:p>
       <w:pPr>
         <w:pStyle w:val="ListBullet"/>
+      </w:pPr>
+      <w:r>
+        <w:t>Add HTU21D humidity/temperature mapping check on i2c2.</w:t>
+      </w:r>
+    </w:p>
+    <w:p>
+      <w:pPr>
+        <w:pStyle w:val="ListBullet"/>
         <w:spacing w:after="80"/>
       </w:pPr>
       <w:r>
-        <w:rPr>
-          <w:rFonts w:ascii="Calibri" w:hAnsi="Calibri"/>
-          <w:color w:val="1A1F26"/>
-          <w:sz w:val="20"/>
-        </w:rPr>
-        <w:t>Add pressure SPI device ID read.</w:t>
+        <w:t>Add MS5803 reset, PROM read, CRC check, and ADC conversion read over SPI.</w:t>
       </w:r>
     </w:p>
     <w:p>
@@ -8931,12 +9260,7 @@
         <w:spacing w:after="80"/>
       </w:pPr>
       <w:r>
-        <w:rPr>
-          <w:rFonts w:ascii="Calibri" w:hAnsi="Calibri"/>
-          <w:color w:val="1A1F26"/>
-          <w:sz w:val="20"/>
-        </w:rPr>
-        <w:t>Implement methane UART protocol driver.</w:t>
+        <w:t>Implement Dynament UART stream parser with DLE byte-stuff handling.</w:t>
       </w:r>
     </w:p>
     <w:p>
@@ -8951,6 +9275,14 @@
           <w:sz w:val="20"/>
         </w:rPr>
         <w:t>Implement pressure sensor driver.</w:t>
+      </w:r>
+    </w:p>
+    <w:p>
+      <w:pPr>
+        <w:pStyle w:val="ListBullet"/>
+      </w:pPr>
+      <w:r>
+        <w:t>Implement HTU21D sample fetch and data-model update.</w:t>
       </w:r>
     </w:p>
     <w:p>
@@ -9149,26 +9481,24 @@
         <w:spacing w:after="80"/>
       </w:pPr>
       <w:r>
-        <w:rPr>
-          <w:rFonts w:ascii="Calibri" w:hAnsi="Calibri"/>
-          <w:color w:val="1A1F26"/>
-          <w:sz w:val="20"/>
-        </w:rPr>
-        <w:t>Exact methane sensor module and UART protocol.</w:t>
+        <w:t>Exact Dynament methane ordered range: 0-5% volume, 0-100% volume, or 0-5-100% volume.</w:t>
       </w:r>
     </w:p>
     <w:p>
       <w:pPr>
         <w:pStyle w:val="ListBullet"/>
+      </w:pPr>
+      <w:r>
+        <w:t>Whether HTU21D is powered from +3V3_PRE or another rail in the final PCB.</w:t>
+      </w:r>
+    </w:p>
+    <w:p>
+      <w:pPr>
+        <w:pStyle w:val="ListBullet"/>
         <w:spacing w:after="80"/>
       </w:pPr>
       <w:r>
-        <w:rPr>
-          <w:rFonts w:ascii="Calibri" w:hAnsi="Calibri"/>
-          <w:color w:val="1A1F26"/>
-          <w:sz w:val="20"/>
-        </w:rPr>
-        <w:t>Exact pressure sensor part number, SPI mode, and PS polarity.</w:t>
+        <w:t>Exact pressure oversampling ratio and conversion timing policy.</w:t>
       </w:r>
     </w:p>
     <w:p>

</xml_diff>

<commit_message>
Add shell runtime settings commands
</commit_message>
<xml_diff>
--- a/docs/firmware-overview.docx
+++ b/docs/firmware-overview.docx
@@ -5262,7 +5262,7 @@
               <w:rPr>
                 <w:rFonts w:ascii="Arial" w:hAnsi="Arial" w:eastAsia="Arial"/>
                 <w:b/>
-                <w:sz w:val="15"/>
+                <w:sz w:val="14"/>
               </w:rPr>
               <w:t>Output</w:t>
             </w:r>
@@ -5283,7 +5283,7 @@
               <w:rPr>
                 <w:rFonts w:ascii="Arial" w:hAnsi="Arial" w:eastAsia="Arial"/>
                 <w:b/>
-                <w:sz w:val="15"/>
+                <w:sz w:val="14"/>
               </w:rPr>
               <w:t>GP8302 alias/node</w:t>
             </w:r>
@@ -5304,7 +5304,7 @@
               <w:rPr>
                 <w:rFonts w:ascii="Arial" w:hAnsi="Arial" w:eastAsia="Arial"/>
                 <w:b/>
-                <w:sz w:val="15"/>
+                <w:sz w:val="14"/>
               </w:rPr>
               <w:t>I2C bus</w:t>
             </w:r>
@@ -5325,7 +5325,7 @@
               <w:rPr>
                 <w:rFonts w:ascii="Arial" w:hAnsi="Arial" w:eastAsia="Arial"/>
                 <w:b/>
-                <w:sz w:val="15"/>
+                <w:sz w:val="14"/>
               </w:rPr>
               <w:t>I2C address</w:t>
             </w:r>
@@ -5346,7 +5346,7 @@
               <w:rPr>
                 <w:rFonts w:ascii="Arial" w:hAnsi="Arial" w:eastAsia="Arial"/>
                 <w:b/>
-                <w:sz w:val="15"/>
+                <w:sz w:val="14"/>
               </w:rPr>
               <w:t>Source value</w:t>
             </w:r>
@@ -5367,7 +5367,7 @@
               <w:rPr>
                 <w:rFonts w:ascii="Arial" w:hAnsi="Arial" w:eastAsia="Arial"/>
                 <w:b/>
-                <w:sz w:val="15"/>
+                <w:sz w:val="14"/>
               </w:rPr>
               <w:t>Default low point</w:t>
             </w:r>
@@ -5388,7 +5388,7 @@
               <w:rPr>
                 <w:rFonts w:ascii="Arial" w:hAnsi="Arial" w:eastAsia="Arial"/>
                 <w:b/>
-                <w:sz w:val="15"/>
+                <w:sz w:val="14"/>
               </w:rPr>
               <w:t>Default high point</w:t>
             </w:r>
@@ -7783,6 +7783,56 @@
           <w:sz w:val="19"/>
         </w:rPr>
         <w:t>RS485 termination state.</w:t>
+      </w:r>
+    </w:p>
+    <w:p>
+      <w:r>
+        <w:rPr>
+          <w:rFonts w:ascii="Arial" w:hAnsi="Arial" w:eastAsia="Arial"/>
+          <w:sz w:val="19"/>
+        </w:rPr>
+        <w:t>The shell exposes the same runtime record for field service:</w:t>
+      </w:r>
+    </w:p>
+    <w:p>
+      <w:pPr>
+        <w:pStyle w:val="ArgiSenseCode"/>
+      </w:pPr>
+      <w:r>
+        <w:t>argisense settings list</w:t>
+      </w:r>
+    </w:p>
+    <w:p>
+      <w:pPr>
+        <w:pStyle w:val="ArgiSenseCode"/>
+      </w:pPr>
+      <w:r>
+        <w:t>argisense settings get &lt;name|alias&gt;</w:t>
+      </w:r>
+    </w:p>
+    <w:p>
+      <w:pPr>
+        <w:pStyle w:val="ArgiSenseCode"/>
+      </w:pPr>
+      <w:r>
+        <w:t>argisense settings set &lt;name|alias&gt; &lt;value&gt;</w:t>
+      </w:r>
+    </w:p>
+    <w:p>
+      <w:pPr>
+        <w:pStyle w:val="ArgiSenseCode"/>
+      </w:pPr>
+      <w:r>
+        <w:t>argisense settings reset</w:t>
+      </w:r>
+    </w:p>
+    <w:p>
+      <w:r>
+        <w:rPr>
+          <w:rFonts w:ascii="Arial" w:hAnsi="Arial" w:eastAsia="Arial"/>
+          <w:sz w:val="19"/>
+        </w:rPr>
+        <w:t>Every shell write is validated by the settings module before it is saved to NVS. RS485 baudrate and Modbus address writes are persistent immediately, but the running RS485 server uses the old transport parameters until the next reboot.</w:t>
       </w:r>
     </w:p>
     <w:p>

</xml_diff>

<commit_message>
Add USB-C MCUmgr update GUI
</commit_message>
<xml_diff>
--- a/docs/firmware-overview.docx
+++ b/docs/firmware-overview.docx
@@ -8985,6 +8985,247 @@
           <w:sz w:val="19"/>
         </w:rPr>
         <w:t>installer configuration.</w:t>
+      </w:r>
+    </w:p>
+    <w:p>
+      <w:r>
+        <w:br w:type="page"/>
+      </w:r>
+    </w:p>
+    <w:p>
+      <w:pPr>
+        <w:pStyle w:val="Heading1"/>
+      </w:pPr>
+      <w:r>
+        <w:rPr>
+          <w:sz w:val="21"/>
+        </w:rPr>
+        <w:t>USB-C MCUmgr Firmware Update Notes</w:t>
+      </w:r>
+    </w:p>
+    <w:p>
+      <w:r>
+        <w:rPr>
+          <w:b/>
+          <w:sz w:val="21"/>
+        </w:rPr>
+        <w:t xml:space="preserve">Scope. </w:t>
+      </w:r>
+      <w:r>
+        <w:rPr>
+          <w:sz w:val="21"/>
+        </w:rPr>
+        <w:t xml:space="preserve">The firmware now supports a USB-C service profile for factory and bring-up work. Build with the </w:t>
+      </w:r>
+      <w:r>
+        <w:rPr>
+          <w:i/>
+          <w:sz w:val="21"/>
+        </w:rPr>
+        <w:t>argisense-usb-update</w:t>
+      </w:r>
+      <w:r>
+        <w:rPr>
+          <w:sz w:val="21"/>
+        </w:rPr>
+        <w:t xml:space="preserve"> snippet, or use the compile helper's usbupdate option, to expose two CDC ACM interfaces on the board USB-C connector.</w:t>
+      </w:r>
+    </w:p>
+    <w:tbl>
+      <w:tblPr>
+        <w:tblStyle w:val="TableGrid"/>
+        <w:tblW w:type="auto" w:w="0"/>
+        <w:tblLook w:firstColumn="1" w:firstRow="1" w:lastColumn="0" w:lastRow="0" w:noHBand="0" w:noVBand="1" w:val="04A0"/>
+      </w:tblPr>
+      <w:tblGrid>
+        <w:gridCol w:w="5184"/>
+        <w:gridCol w:w="5184"/>
+      </w:tblGrid>
+      <w:tr>
+        <w:tc>
+          <w:tcPr>
+            <w:tcW w:type="dxa" w:w="5184"/>
+          </w:tcPr>
+          <w:p>
+            <w:r>
+              <w:rPr>
+                <w:b/>
+              </w:rPr>
+              <w:t>USB interface</w:t>
+            </w:r>
+          </w:p>
+        </w:tc>
+        <w:tc>
+          <w:tcPr>
+            <w:tcW w:type="dxa" w:w="5184"/>
+          </w:tcPr>
+          <w:p>
+            <w:r>
+              <w:rPr>
+                <w:b/>
+              </w:rPr>
+              <w:t>Firmware role</w:t>
+            </w:r>
+          </w:p>
+        </w:tc>
+      </w:tr>
+      <w:tr>
+        <w:tc>
+          <w:tcPr>
+            <w:tcW w:type="dxa" w:w="5184"/>
+          </w:tcPr>
+          <w:p>
+            <w:r>
+              <w:t>CDC ACM 0</w:t>
+            </w:r>
+          </w:p>
+        </w:tc>
+        <w:tc>
+          <w:tcPr>
+            <w:tcW w:type="dxa" w:w="5184"/>
+          </w:tcPr>
+          <w:p>
+            <w:r>
+              <w:t>Zephyr console, log output, and shell</w:t>
+            </w:r>
+          </w:p>
+        </w:tc>
+      </w:tr>
+      <w:tr>
+        <w:tc>
+          <w:tcPr>
+            <w:tcW w:type="dxa" w:w="5184"/>
+          </w:tcPr>
+          <w:p>
+            <w:r>
+              <w:t>CDC ACM 1</w:t>
+            </w:r>
+          </w:p>
+        </w:tc>
+        <w:tc>
+          <w:tcPr>
+            <w:tcW w:type="dxa" w:w="5184"/>
+          </w:tcPr>
+          <w:p>
+            <w:r>
+              <w:t>MCUmgr SMP firmware update transport</w:t>
+            </w:r>
+          </w:p>
+        </w:tc>
+      </w:tr>
+    </w:tbl>
+    <w:p>
+      <w:r>
+        <w:rPr>
+          <w:b/>
+          <w:sz w:val="21"/>
+        </w:rPr>
+        <w:t xml:space="preserve">PC update tool. </w:t>
+      </w:r>
+      <w:r>
+        <w:rPr>
+          <w:sz w:val="21"/>
+        </w:rPr>
+        <w:t xml:space="preserve">The repository includes a Python/Tkinter USB-C updater at </w:t>
+      </w:r>
+      <w:r>
+        <w:rPr>
+          <w:i/>
+          <w:sz w:val="21"/>
+        </w:rPr>
+        <w:t>tools/usb_mcumgr/argisense_usb_mcumgr_gui.py</w:t>
+      </w:r>
+      <w:r>
+        <w:rPr>
+          <w:sz w:val="21"/>
+        </w:rPr>
+        <w:t>. It selects the MCUmgr COM port, probes image list, parses the signed image header, shows version and size, runs upload/test/reset, and displays upload progress from mcumgr.</w:t>
+      </w:r>
+    </w:p>
+    <w:p>
+      <w:r>
+        <w:rPr>
+          <w:b/>
+          <w:sz w:val="21"/>
+        </w:rPr>
+        <w:t xml:space="preserve">Upload behavior. </w:t>
+      </w:r>
+      <w:r>
+        <w:rPr>
+          <w:sz w:val="21"/>
+        </w:rPr>
+        <w:t xml:space="preserve">Keep the GUI option </w:t>
+      </w:r>
+      <w:r>
+        <w:rPr>
+          <w:i/>
+          <w:sz w:val="21"/>
+        </w:rPr>
+        <w:t>Erase secondary slot before upload</w:t>
+      </w:r>
+      <w:r>
+        <w:rPr>
+          <w:sz w:val="21"/>
+        </w:rPr>
+        <w:t xml:space="preserve"> enabled for normal service. This passes </w:t>
+      </w:r>
+      <w:r>
+        <w:rPr>
+          <w:i/>
+          <w:sz w:val="21"/>
+        </w:rPr>
+        <w:t>--noerase=false</w:t>
+      </w:r>
+      <w:r>
+        <w:rPr>
+          <w:sz w:val="21"/>
+        </w:rPr>
+        <w:t xml:space="preserve"> to mcumgr image upload and avoids stale data in the MCUboot secondary slot.</w:t>
+      </w:r>
+    </w:p>
+    <w:p>
+      <w:r>
+        <w:rPr>
+          <w:b/>
+          <w:sz w:val="21"/>
+        </w:rPr>
+        <w:t xml:space="preserve">Logging note. </w:t>
+      </w:r>
+      <w:r>
+        <w:rPr>
+          <w:sz w:val="21"/>
+        </w:rPr>
+        <w:t>The USB update snippet disables the mcumgr_img_grp log module because Zephyr's optional upload match check can print a misleading SHA-256 error when the full file hash and MCUboot image hash differ. RS485 DFU still keeps explicit CRC32 and SHA-256 verification in the application path.</w:t>
+      </w:r>
+    </w:p>
+    <w:p>
+      <w:r>
+        <w:rPr>
+          <w:b/>
+          <w:sz w:val="21"/>
+        </w:rPr>
+        <w:t xml:space="preserve">Rollback policy. </w:t>
+      </w:r>
+      <w:r>
+        <w:rPr>
+          <w:sz w:val="21"/>
+        </w:rPr>
+        <w:t>Current bring-up and field-service builds keep MCUboot downgrade prevention disabled so an older known-good firmware can be installed when needed. Production builds can re-enable downgrade prevention after the final release policy is fixed.</w:t>
+      </w:r>
+    </w:p>
+    <w:p>
+      <w:r>
+        <w:rPr>
+          <w:b/>
+          <w:sz w:val="21"/>
+        </w:rPr>
+        <w:t xml:space="preserve">Related source files. </w:t>
+      </w:r>
+      <w:r>
+        <w:rPr>
+          <w:sz w:val="21"/>
+        </w:rPr>
+        <w:t>README.md, snippets/argisense-usb-update/argisense_usb_update.conf, sysbuild/mcuboot.conf, sysbuild/argisense-zephyr-app.conf, and tools/usb_mcumgr/.</w:t>
       </w:r>
     </w:p>
     <w:sectPr>

</xml_diff>

<commit_message>
Fix firmware overview table page break
</commit_message>
<xml_diff>
--- a/docs/firmware-overview.docx
+++ b/docs/firmware-overview.docx
@@ -36,6 +36,7 @@
     <w:p>
       <w:pPr>
         <w:pStyle w:val="Heading2"/>
+        <w:keepNext/>
       </w:pPr>
       <w:r>
         <w:t>System Illustrations</w:t>
@@ -202,6 +203,7 @@
     <w:p>
       <w:pPr>
         <w:pStyle w:val="Heading2"/>
+        <w:keepNext/>
       </w:pPr>
       <w:r>
         <w:t>Product Board Split</w:t>
@@ -263,6 +265,10 @@
         <w:gridCol w:w="2556"/>
       </w:tblGrid>
       <w:tr>
+        <w:trPr>
+          <w:cantSplit/>
+          <w:tblHeader w:val="true"/>
+        </w:trPr>
         <w:tc>
           <w:tcPr>
             <w:tcW w:type="dxa" w:w="2556"/>
@@ -353,6 +359,9 @@
         </w:tc>
       </w:tr>
       <w:tr>
+        <w:trPr>
+          <w:cantSplit/>
+        </w:trPr>
         <w:tc>
           <w:tcPr>
             <w:tcW w:type="dxa" w:w="2556"/>
@@ -435,6 +444,9 @@
         </w:tc>
       </w:tr>
       <w:tr>
+        <w:trPr>
+          <w:cantSplit/>
+        </w:trPr>
         <w:tc>
           <w:tcPr>
             <w:tcW w:type="dxa" w:w="2556"/>
@@ -530,6 +542,7 @@
     <w:p>
       <w:pPr>
         <w:pStyle w:val="Heading2"/>
+        <w:keepNext/>
       </w:pPr>
       <w:r>
         <w:t>Firmware Goals</w:t>
@@ -599,6 +612,7 @@
     <w:p>
       <w:pPr>
         <w:pStyle w:val="Heading2"/>
+        <w:keepNext/>
       </w:pPr>
       <w:r>
         <w:t>Methane + Pressure Board Interfaces</w:t>
@@ -624,6 +638,10 @@
         <w:gridCol w:w="2556"/>
       </w:tblGrid>
       <w:tr>
+        <w:trPr>
+          <w:cantSplit/>
+          <w:tblHeader w:val="true"/>
+        </w:trPr>
         <w:tc>
           <w:tcPr>
             <w:tcW w:type="dxa" w:w="2556"/>
@@ -714,6 +732,9 @@
         </w:tc>
       </w:tr>
       <w:tr>
+        <w:trPr>
+          <w:cantSplit/>
+        </w:trPr>
         <w:tc>
           <w:tcPr>
             <w:tcW w:type="dxa" w:w="2556"/>
@@ -796,6 +817,9 @@
         </w:tc>
       </w:tr>
       <w:tr>
+        <w:trPr>
+          <w:cantSplit/>
+        </w:trPr>
         <w:tc>
           <w:tcPr>
             <w:tcW w:type="dxa" w:w="2556"/>
@@ -882,6 +906,9 @@
         </w:tc>
       </w:tr>
       <w:tr>
+        <w:trPr>
+          <w:cantSplit/>
+        </w:trPr>
         <w:tc>
           <w:tcPr>
             <w:tcW w:type="dxa" w:w="2556"/>
@@ -964,6 +991,9 @@
         </w:tc>
       </w:tr>
       <w:tr>
+        <w:trPr>
+          <w:cantSplit/>
+        </w:trPr>
         <w:tc>
           <w:tcPr>
             <w:tcW w:type="dxa" w:w="2556"/>
@@ -1050,6 +1080,9 @@
         </w:tc>
       </w:tr>
       <w:tr>
+        <w:trPr>
+          <w:cantSplit/>
+        </w:trPr>
         <w:tc>
           <w:tcPr>
             <w:tcW w:type="dxa" w:w="2556"/>
@@ -1132,6 +1165,9 @@
         </w:tc>
       </w:tr>
       <w:tr>
+        <w:trPr>
+          <w:cantSplit/>
+        </w:trPr>
         <w:tc>
           <w:tcPr>
             <w:tcW w:type="dxa" w:w="2556"/>
@@ -1218,6 +1254,9 @@
         </w:tc>
       </w:tr>
       <w:tr>
+        <w:trPr>
+          <w:cantSplit/>
+        </w:trPr>
         <w:tc>
           <w:tcPr>
             <w:tcW w:type="dxa" w:w="2556"/>
@@ -1300,6 +1339,9 @@
         </w:tc>
       </w:tr>
       <w:tr>
+        <w:trPr>
+          <w:cantSplit/>
+        </w:trPr>
         <w:tc>
           <w:tcPr>
             <w:tcW w:type="dxa" w:w="2556"/>
@@ -1386,6 +1428,9 @@
         </w:tc>
       </w:tr>
       <w:tr>
+        <w:trPr>
+          <w:cantSplit/>
+        </w:trPr>
         <w:tc>
           <w:tcPr>
             <w:tcW w:type="dxa" w:w="2556"/>
@@ -1488,6 +1533,10 @@
         <w:gridCol w:w="3408"/>
       </w:tblGrid>
       <w:tr>
+        <w:trPr>
+          <w:cantSplit/>
+          <w:tblHeader w:val="true"/>
+        </w:trPr>
         <w:tc>
           <w:tcPr>
             <w:tcW w:type="dxa" w:w="3408"/>
@@ -1556,6 +1605,9 @@
         </w:tc>
       </w:tr>
       <w:tr>
+        <w:trPr>
+          <w:cantSplit/>
+        </w:trPr>
         <w:tc>
           <w:tcPr>
             <w:tcW w:type="dxa" w:w="3408"/>
@@ -1618,6 +1670,9 @@
         </w:tc>
       </w:tr>
       <w:tr>
+        <w:trPr>
+          <w:cantSplit/>
+        </w:trPr>
         <w:tc>
           <w:tcPr>
             <w:tcW w:type="dxa" w:w="3408"/>
@@ -1683,6 +1738,9 @@
         </w:tc>
       </w:tr>
       <w:tr>
+        <w:trPr>
+          <w:cantSplit/>
+        </w:trPr>
         <w:tc>
           <w:tcPr>
             <w:tcW w:type="dxa" w:w="3408"/>
@@ -1745,6 +1803,9 @@
         </w:tc>
       </w:tr>
       <w:tr>
+        <w:trPr>
+          <w:cantSplit/>
+        </w:trPr>
         <w:tc>
           <w:tcPr>
             <w:tcW w:type="dxa" w:w="3408"/>
@@ -1810,6 +1871,9 @@
         </w:tc>
       </w:tr>
       <w:tr>
+        <w:trPr>
+          <w:cantSplit/>
+        </w:trPr>
         <w:tc>
           <w:tcPr>
             <w:tcW w:type="dxa" w:w="3408"/>
@@ -1872,6 +1936,9 @@
         </w:tc>
       </w:tr>
       <w:tr>
+        <w:trPr>
+          <w:cantSplit/>
+        </w:trPr>
         <w:tc>
           <w:tcPr>
             <w:tcW w:type="dxa" w:w="3408"/>
@@ -1937,6 +2004,9 @@
         </w:tc>
       </w:tr>
       <w:tr>
+        <w:trPr>
+          <w:cantSplit/>
+        </w:trPr>
         <w:tc>
           <w:tcPr>
             <w:tcW w:type="dxa" w:w="3408"/>
@@ -1999,6 +2069,9 @@
         </w:tc>
       </w:tr>
       <w:tr>
+        <w:trPr>
+          <w:cantSplit/>
+        </w:trPr>
         <w:tc>
           <w:tcPr>
             <w:tcW w:type="dxa" w:w="3408"/>
@@ -2064,6 +2137,9 @@
         </w:tc>
       </w:tr>
       <w:tr>
+        <w:trPr>
+          <w:cantSplit/>
+        </w:trPr>
         <w:tc>
           <w:tcPr>
             <w:tcW w:type="dxa" w:w="3408"/>
@@ -2126,6 +2202,9 @@
         </w:tc>
       </w:tr>
       <w:tr>
+        <w:trPr>
+          <w:cantSplit/>
+        </w:trPr>
         <w:tc>
           <w:tcPr>
             <w:tcW w:type="dxa" w:w="3408"/>
@@ -2191,6 +2270,9 @@
         </w:tc>
       </w:tr>
       <w:tr>
+        <w:trPr>
+          <w:cantSplit/>
+        </w:trPr>
         <w:tc>
           <w:tcPr>
             <w:tcW w:type="dxa" w:w="3408"/>
@@ -2253,6 +2335,9 @@
         </w:tc>
       </w:tr>
       <w:tr>
+        <w:trPr>
+          <w:cantSplit/>
+        </w:trPr>
         <w:tc>
           <w:tcPr>
             <w:tcW w:type="dxa" w:w="3408"/>
@@ -2318,6 +2403,9 @@
         </w:tc>
       </w:tr>
       <w:tr>
+        <w:trPr>
+          <w:cantSplit/>
+        </w:trPr>
         <w:tc>
           <w:tcPr>
             <w:tcW w:type="dxa" w:w="3408"/>
@@ -2380,6 +2468,9 @@
         </w:tc>
       </w:tr>
       <w:tr>
+        <w:trPr>
+          <w:cantSplit/>
+        </w:trPr>
         <w:tc>
           <w:tcPr>
             <w:tcW w:type="dxa" w:w="3408"/>
@@ -2445,6 +2536,9 @@
         </w:tc>
       </w:tr>
       <w:tr>
+        <w:trPr>
+          <w:cantSplit/>
+        </w:trPr>
         <w:tc>
           <w:tcPr>
             <w:tcW w:type="dxa" w:w="3408"/>
@@ -2511,6 +2605,7 @@
     <w:p>
       <w:pPr>
         <w:pStyle w:val="Heading2"/>
+        <w:keepNext/>
       </w:pPr>
       <w:r>
         <w:t>Runtime Model</w:t>
@@ -2540,6 +2635,10 @@
         <w:gridCol w:w="3408"/>
       </w:tblGrid>
       <w:tr>
+        <w:trPr>
+          <w:cantSplit/>
+          <w:tblHeader w:val="true"/>
+        </w:trPr>
         <w:tc>
           <w:tcPr>
             <w:tcW w:type="dxa" w:w="3408"/>
@@ -2608,6 +2707,9 @@
         </w:tc>
       </w:tr>
       <w:tr>
+        <w:trPr>
+          <w:cantSplit/>
+        </w:trPr>
         <w:tc>
           <w:tcPr>
             <w:tcW w:type="dxa" w:w="3408"/>
@@ -2670,6 +2772,9 @@
         </w:tc>
       </w:tr>
       <w:tr>
+        <w:trPr>
+          <w:cantSplit/>
+        </w:trPr>
         <w:tc>
           <w:tcPr>
             <w:tcW w:type="dxa" w:w="3408"/>
@@ -2735,6 +2840,9 @@
         </w:tc>
       </w:tr>
       <w:tr>
+        <w:trPr>
+          <w:cantSplit/>
+        </w:trPr>
         <w:tc>
           <w:tcPr>
             <w:tcW w:type="dxa" w:w="3408"/>
@@ -2797,6 +2905,9 @@
         </w:tc>
       </w:tr>
       <w:tr>
+        <w:trPr>
+          <w:cantSplit/>
+        </w:trPr>
         <w:tc>
           <w:tcPr>
             <w:tcW w:type="dxa" w:w="3408"/>
@@ -2862,6 +2973,9 @@
         </w:tc>
       </w:tr>
       <w:tr>
+        <w:trPr>
+          <w:cantSplit/>
+        </w:trPr>
         <w:tc>
           <w:tcPr>
             <w:tcW w:type="dxa" w:w="3408"/>
@@ -2924,6 +3038,9 @@
         </w:tc>
       </w:tr>
       <w:tr>
+        <w:trPr>
+          <w:cantSplit/>
+        </w:trPr>
         <w:tc>
           <w:tcPr>
             <w:tcW w:type="dxa" w:w="3408"/>
@@ -2989,6 +3106,9 @@
         </w:tc>
       </w:tr>
       <w:tr>
+        <w:trPr>
+          <w:cantSplit/>
+        </w:trPr>
         <w:tc>
           <w:tcPr>
             <w:tcW w:type="dxa" w:w="3408"/>
@@ -3051,6 +3171,9 @@
         </w:tc>
       </w:tr>
       <w:tr>
+        <w:trPr>
+          <w:cantSplit/>
+        </w:trPr>
         <w:tc>
           <w:tcPr>
             <w:tcW w:type="dxa" w:w="3408"/>
@@ -3116,6 +3239,9 @@
         </w:tc>
       </w:tr>
       <w:tr>
+        <w:trPr>
+          <w:cantSplit/>
+        </w:trPr>
         <w:tc>
           <w:tcPr>
             <w:tcW w:type="dxa" w:w="3408"/>
@@ -3178,6 +3304,9 @@
         </w:tc>
       </w:tr>
       <w:tr>
+        <w:trPr>
+          <w:cantSplit/>
+        </w:trPr>
         <w:tc>
           <w:tcPr>
             <w:tcW w:type="dxa" w:w="3408"/>
@@ -3243,6 +3372,9 @@
         </w:tc>
       </w:tr>
       <w:tr>
+        <w:trPr>
+          <w:cantSplit/>
+        </w:trPr>
         <w:tc>
           <w:tcPr>
             <w:tcW w:type="dxa" w:w="3408"/>
@@ -3305,6 +3437,9 @@
         </w:tc>
       </w:tr>
       <w:tr>
+        <w:trPr>
+          <w:cantSplit/>
+        </w:trPr>
         <w:tc>
           <w:tcPr>
             <w:tcW w:type="dxa" w:w="3408"/>
@@ -3370,6 +3505,9 @@
         </w:tc>
       </w:tr>
       <w:tr>
+        <w:trPr>
+          <w:cantSplit/>
+        </w:trPr>
         <w:tc>
           <w:tcPr>
             <w:tcW w:type="dxa" w:w="3408"/>
@@ -3694,6 +3832,7 @@
     <w:p>
       <w:pPr>
         <w:pStyle w:val="Heading2"/>
+        <w:keepNext/>
       </w:pPr>
       <w:r>
         <w:t>Measurement Cycle</w:t>
@@ -4063,6 +4202,7 @@
     <w:p>
       <w:pPr>
         <w:pStyle w:val="Heading2"/>
+        <w:keepNext/>
       </w:pPr>
       <w:r>
         <w:t>Methane Sensor Handling</w:t>
@@ -4303,6 +4443,7 @@
     <w:p>
       <w:pPr>
         <w:pStyle w:val="Heading2"/>
+        <w:keepNext/>
       </w:pPr>
       <w:r>
         <w:t>Humidity Sensor Handling</w:t>
@@ -4436,6 +4577,7 @@
     <w:p>
       <w:pPr>
         <w:pStyle w:val="Heading2"/>
+        <w:keepNext/>
       </w:pPr>
       <w:r>
         <w:t>Pressure Sensor Handling</w:t>
@@ -4581,6 +4723,7 @@
     <w:p>
       <w:pPr>
         <w:pStyle w:val="Heading2"/>
+        <w:keepNext/>
       </w:pPr>
       <w:r>
         <w:t>Dual GP8302 4-20 mA Outputs</w:t>
@@ -4614,6 +4757,10 @@
         <w:gridCol w:w="1461"/>
       </w:tblGrid>
       <w:tr>
+        <w:trPr>
+          <w:cantSplit/>
+          <w:tblHeader w:val="true"/>
+        </w:trPr>
         <w:tc>
           <w:tcPr>
             <w:tcW w:type="dxa" w:w="1461"/>
@@ -4770,6 +4917,9 @@
         </w:tc>
       </w:tr>
       <w:tr>
+        <w:trPr>
+          <w:cantSplit/>
+        </w:trPr>
         <w:tc>
           <w:tcPr>
             <w:tcW w:type="dxa" w:w="1461"/>
@@ -4912,6 +5062,9 @@
         </w:tc>
       </w:tr>
       <w:tr>
+        <w:trPr>
+          <w:cantSplit/>
+        </w:trPr>
         <w:tc>
           <w:tcPr>
             <w:tcW w:type="dxa" w:w="1461"/>
@@ -5297,6 +5450,7 @@
     <w:p>
       <w:pPr>
         <w:pStyle w:val="Heading2"/>
+        <w:keepNext/>
       </w:pPr>
       <w:r>
         <w:t>RS485 Communication</w:t>
@@ -5364,6 +5518,10 @@
         <w:gridCol w:w="5112"/>
       </w:tblGrid>
       <w:tr>
+        <w:trPr>
+          <w:cantSplit/>
+          <w:tblHeader w:val="true"/>
+        </w:trPr>
         <w:tc>
           <w:tcPr>
             <w:tcW w:type="dxa" w:w="5112"/>
@@ -5410,6 +5568,9 @@
         </w:tc>
       </w:tr>
       <w:tr>
+        <w:trPr>
+          <w:cantSplit/>
+        </w:trPr>
         <w:tc>
           <w:tcPr>
             <w:tcW w:type="dxa" w:w="5112"/>
@@ -5452,6 +5613,9 @@
         </w:tc>
       </w:tr>
       <w:tr>
+        <w:trPr>
+          <w:cantSplit/>
+        </w:trPr>
         <w:tc>
           <w:tcPr>
             <w:tcW w:type="dxa" w:w="5112"/>
@@ -5496,6 +5660,9 @@
         </w:tc>
       </w:tr>
       <w:tr>
+        <w:trPr>
+          <w:cantSplit/>
+        </w:trPr>
         <w:tc>
           <w:tcPr>
             <w:tcW w:type="dxa" w:w="5112"/>
@@ -5538,6 +5705,9 @@
         </w:tc>
       </w:tr>
       <w:tr>
+        <w:trPr>
+          <w:cantSplit/>
+        </w:trPr>
         <w:tc>
           <w:tcPr>
             <w:tcW w:type="dxa" w:w="5112"/>
@@ -5582,6 +5752,9 @@
         </w:tc>
       </w:tr>
       <w:tr>
+        <w:trPr>
+          <w:cantSplit/>
+        </w:trPr>
         <w:tc>
           <w:tcPr>
             <w:tcW w:type="dxa" w:w="5112"/>
@@ -5624,6 +5797,9 @@
         </w:tc>
       </w:tr>
       <w:tr>
+        <w:trPr>
+          <w:cantSplit/>
+        </w:trPr>
         <w:tc>
           <w:tcPr>
             <w:tcW w:type="dxa" w:w="5112"/>
@@ -5668,6 +5844,9 @@
         </w:tc>
       </w:tr>
       <w:tr>
+        <w:trPr>
+          <w:cantSplit/>
+        </w:trPr>
         <w:tc>
           <w:tcPr>
             <w:tcW w:type="dxa" w:w="5112"/>
@@ -5710,6 +5889,9 @@
         </w:tc>
       </w:tr>
       <w:tr>
+        <w:trPr>
+          <w:cantSplit/>
+        </w:trPr>
         <w:tc>
           <w:tcPr>
             <w:tcW w:type="dxa" w:w="5112"/>
@@ -5774,6 +5956,10 @@
         <w:gridCol w:w="3408"/>
       </w:tblGrid>
       <w:tr>
+        <w:trPr>
+          <w:cantSplit/>
+          <w:tblHeader w:val="true"/>
+        </w:trPr>
         <w:tc>
           <w:tcPr>
             <w:tcW w:type="dxa" w:w="3408"/>
@@ -5842,6 +6028,9 @@
         </w:tc>
       </w:tr>
       <w:tr>
+        <w:trPr>
+          <w:cantSplit/>
+        </w:trPr>
         <w:tc>
           <w:tcPr>
             <w:tcW w:type="dxa" w:w="3408"/>
@@ -5904,6 +6093,9 @@
         </w:tc>
       </w:tr>
       <w:tr>
+        <w:trPr>
+          <w:cantSplit/>
+        </w:trPr>
         <w:tc>
           <w:tcPr>
             <w:tcW w:type="dxa" w:w="3408"/>
@@ -5969,6 +6161,9 @@
         </w:tc>
       </w:tr>
       <w:tr>
+        <w:trPr>
+          <w:cantSplit/>
+        </w:trPr>
         <w:tc>
           <w:tcPr>
             <w:tcW w:type="dxa" w:w="3408"/>
@@ -6031,6 +6226,9 @@
         </w:tc>
       </w:tr>
       <w:tr>
+        <w:trPr>
+          <w:cantSplit/>
+        </w:trPr>
         <w:tc>
           <w:tcPr>
             <w:tcW w:type="dxa" w:w="3408"/>
@@ -6096,6 +6294,9 @@
         </w:tc>
       </w:tr>
       <w:tr>
+        <w:trPr>
+          <w:cantSplit/>
+        </w:trPr>
         <w:tc>
           <w:tcPr>
             <w:tcW w:type="dxa" w:w="3408"/>
@@ -6158,6 +6359,9 @@
         </w:tc>
       </w:tr>
       <w:tr>
+        <w:trPr>
+          <w:cantSplit/>
+        </w:trPr>
         <w:tc>
           <w:tcPr>
             <w:tcW w:type="dxa" w:w="3408"/>
@@ -6223,6 +6427,9 @@
         </w:tc>
       </w:tr>
       <w:tr>
+        <w:trPr>
+          <w:cantSplit/>
+        </w:trPr>
         <w:tc>
           <w:tcPr>
             <w:tcW w:type="dxa" w:w="3408"/>
@@ -6299,6 +6506,7 @@
     <w:p>
       <w:pPr>
         <w:pStyle w:val="Heading2"/>
+        <w:keepNext/>
       </w:pPr>
       <w:r>
         <w:t>USB-C Firmware Update and Service Console</w:t>
@@ -6436,6 +6644,7 @@
     <w:p>
       <w:pPr>
         <w:pStyle w:val="Heading2"/>
+        <w:keepNext/>
       </w:pPr>
       <w:r>
         <w:t>Data Model</w:t>
@@ -6791,6 +7000,7 @@
     <w:p>
       <w:pPr>
         <w:pStyle w:val="Heading2"/>
+        <w:keepNext/>
       </w:pPr>
       <w:r>
         <w:t>Power Strategy</w:t>
@@ -6917,6 +7127,7 @@
     <w:p>
       <w:pPr>
         <w:pStyle w:val="Heading2"/>
+        <w:keepNext/>
       </w:pPr>
       <w:r>
         <w:t>Fault Handling</w:t>
@@ -6990,6 +7201,7 @@
     <w:p>
       <w:pPr>
         <w:pStyle w:val="Heading2"/>
+        <w:keepNext/>
       </w:pPr>
       <w:r>
         <w:t>Calibration and Persistent Settings</w:t>
@@ -7213,19 +7425,32 @@
       </w:r>
     </w:p>
     <w:p>
+      <w:r>
+        <w:br w:type="page"/>
+      </w:r>
+    </w:p>
+    <w:p>
       <w:pPr>
         <w:pStyle w:val="Heading2"/>
+        <w:keepNext/>
       </w:pPr>
       <w:r>
         <w:t>External AT24C512C EEPROM</w:t>
       </w:r>
     </w:p>
     <w:p>
+      <w:pPr>
+        <w:keepNext/>
+      </w:pPr>
       <w:r>
         <w:t>The schematic includes U4, AT24C512C-SSHD-T, connected to MCU_I2C1_SCL and MCU_I2C1_SDA. A0/A1/A2 are strapped for address 0x50, and the part is powered from +3V3_PRE.</w:t>
       </w:r>
     </w:p>
     <w:p>
+      <w:pPr>
+        <w:keepNext/>
+        <w:spacing w:after="0"/>
+      </w:pPr>
       <w:r>
         <w:t>Firmware mapping:</w:t>
       </w:r>
@@ -7243,6 +7468,10 @@
         <w:gridCol w:w="5112"/>
       </w:tblGrid>
       <w:tr>
+        <w:trPr>
+          <w:cantSplit/>
+          <w:tblHeader w:val="true"/>
+        </w:trPr>
         <w:tc>
           <w:tcPr>
             <w:tcW w:type="dxa" w:w="5112"/>
@@ -7289,6 +7518,9 @@
         </w:tc>
       </w:tr>
       <w:tr>
+        <w:trPr>
+          <w:cantSplit/>
+        </w:trPr>
         <w:tc>
           <w:tcPr>
             <w:tcW w:type="dxa" w:w="5112"/>
@@ -7331,6 +7563,9 @@
         </w:tc>
       </w:tr>
       <w:tr>
+        <w:trPr>
+          <w:cantSplit/>
+        </w:trPr>
         <w:tc>
           <w:tcPr>
             <w:tcW w:type="dxa" w:w="5112"/>
@@ -7375,6 +7610,9 @@
         </w:tc>
       </w:tr>
       <w:tr>
+        <w:trPr>
+          <w:cantSplit/>
+        </w:trPr>
         <w:tc>
           <w:tcPr>
             <w:tcW w:type="dxa" w:w="5112"/>
@@ -7417,6 +7655,9 @@
         </w:tc>
       </w:tr>
       <w:tr>
+        <w:trPr>
+          <w:cantSplit/>
+        </w:trPr>
         <w:tc>
           <w:tcPr>
             <w:tcW w:type="dxa" w:w="5112"/>
@@ -7461,6 +7702,9 @@
         </w:tc>
       </w:tr>
       <w:tr>
+        <w:trPr>
+          <w:cantSplit/>
+        </w:trPr>
         <w:tc>
           <w:tcPr>
             <w:tcW w:type="dxa" w:w="5112"/>
@@ -7503,6 +7747,9 @@
         </w:tc>
       </w:tr>
       <w:tr>
+        <w:trPr>
+          <w:cantSplit/>
+        </w:trPr>
         <w:tc>
           <w:tcPr>
             <w:tcW w:type="dxa" w:w="5112"/>
@@ -7547,6 +7794,9 @@
         </w:tc>
       </w:tr>
       <w:tr>
+        <w:trPr>
+          <w:cantSplit/>
+        </w:trPr>
         <w:tc>
           <w:tcPr>
             <w:tcW w:type="dxa" w:w="5112"/>
@@ -7589,6 +7839,9 @@
         </w:tc>
       </w:tr>
       <w:tr>
+        <w:trPr>
+          <w:cantSplit/>
+        </w:trPr>
         <w:tc>
           <w:tcPr>
             <w:tcW w:type="dxa" w:w="5112"/>
@@ -7642,6 +7895,7 @@
     <w:p>
       <w:pPr>
         <w:pStyle w:val="Heading2"/>
+        <w:keepNext/>
       </w:pPr>
       <w:r>
         <w:t>Current Implementation Status</w:t>
@@ -7921,6 +8175,7 @@
     <w:p>
       <w:pPr>
         <w:pStyle w:val="Heading2"/>
+        <w:keepNext/>
       </w:pPr>
       <w:r>
         <w:t>Open Hardware Items</w:t>

</xml_diff>

<commit_message>
Update RS485 service GUI and docs
</commit_message>
<xml_diff>
--- a/docs/firmware-overview.docx
+++ b/docs/firmware-overview.docx
@@ -6499,8 +6499,21 @@
       </w:r>
     </w:p>
     <w:p>
-      <w:r>
-        <w:t>RS485 can also be used as the sealed-product service and firmware update path. The PC GUI in tools/rs485_dfu/argisense_rs485_dfu_gui.py has tabs for firmware update, live sensor monitoring/graphing, and device configuration. It can auto-detect an ArgiSense node by scanning COM ports, supported baud presets, 8-bit Modbus RTU framing variants, parity, stop bits, and Unit IDs until register 0 returns device ID 0xA651. The firmware update tab uploads build/argisense-zephyr-app/zephyr/zephyr.signed.bin over Modbus holding registers. The GUI first writes the configured DFU service unlock key, then the application writes the image to MCUboot image-1, verifies CRC32 and SHA-256, and can mark the verified image for a test swap and reboot. MCUboot performs the swap on the next boot, and the application confirms the image only after a successful measurement and DAC output refresh. The service GUI also exposes a manual Confirm Image action for cases where the operator wants to confirm the currently running image after field validation.</w:t>
+      <w:pPr/>
+      <w:r>
+        <w:t>RS485 can also be used as the sealed-product service and firmware update path. The PC GUI in tools/rs485_dfu/argisense_rs485_dfu_gui.py has tabs for firmware update, live sensor monitoring/graphing, and device configuration. Its Auto Detect flow scans the selected adapter or all available COM ports, supported baud presets, 8-bit Modbus RTU framing variants, parity, stop bits, and the Unit IDs entered in Scan IDs. Each response with register 0 equal to the ArgiSense device ID 0xA651 is added to the Detected devices table, and the scan continues until the requested range is complete. Stop Scan can end a long scan early while keeping any devices already found. The GUI de-duplicates discovery results by COM port, baudrate, and Unit ID so a single physical slave is not shown multiple times if it also responds under another parity/stop-bit probe.</w:t>
+      </w:r>
+    </w:p>
+    <w:p>
+      <w:pPr/>
+      <w:r>
+        <w:t>The firmware update tab uploads build/argisense-zephyr-app/zephyr/zephyr.signed.bin over Modbus holding registers. The GUI first writes the configured DFU service unlock key, then the application writes the image to MCUboot image-1, verifies CRC32 and SHA-256, and can mark the verified image for a test swap and reboot. MCUboot performs the swap on the next boot, and the application confirms the image only after a successful measurement and DAC output refresh. The service GUI also exposes a manual Confirm Image action for cases where the operator wants to confirm the currently running image after field validation. Probe and Confirm Image write visible progress to the log panel and show completion dialogs when the commands finish successfully.</w:t>
+      </w:r>
+    </w:p>
+    <w:p>
+      <w:pPr/>
+      <w:r>
+        <w:t>The sensor tab keeps the latest measurements in a compact three-column layout so the trend graph has more vertical space. The graph displays methane ppm, pressure Pa, and humidity %RH with an auto-scaled grid, sample count, and a readable legend. The status/log panel is separated from the main tabs with a vertical splitter so service logs remain visible during firmware update, auto-detect, and live monitoring.</w:t>
       </w:r>
     </w:p>
     <w:p>
@@ -7422,11 +7435,6 @@
       </w:pPr>
       <w:r>
         <w:t>Keep a settings version and CRC so invalid calibration can be detected.</w:t>
-      </w:r>
-    </w:p>
-    <w:p>
-      <w:r>
-        <w:br w:type="page"/>
       </w:r>
     </w:p>
     <w:p>
@@ -8057,12 +8065,13 @@
         <w:pStyle w:val="ListBullet"/>
       </w:pPr>
       <w:r>
-        <w:t>Python/Tkinter RS485 service GUI under tools/rs485_dfu for auto-detect,</w:t>
-      </w:r>
-    </w:p>
-    <w:p>
-      <w:r>
-        <w:t>firmware update, live sensor graphing, and runtime device configuration.</w:t>
+        <w:t>Python/Tkinter RS485 service GUI under tools/rs485_dfu for full-range</w:t>
+      </w:r>
+    </w:p>
+    <w:p>
+      <w:pPr/>
+      <w:r>
+        <w:t>auto-detect with stop-scan, de-duplicated device discovery, firmware update, visible service logs, live sensor graphing, and runtime device configuration.</w:t>
       </w:r>
     </w:p>
     <w:p>
@@ -8265,6 +8274,8 @@
         <w:t>installer configuration.</w:t>
       </w:r>
     </w:p>
+    <w:p/>
+    <w:p/>
     <w:sectPr>
       <w:footerReference w:type="default" r:id="rId12"/>
       <w:pgSz w:w="12240" w:h="15840"/>

</xml_diff>